<commit_message>
docs: resolve outstanding items and update design
</commit_message>
<xml_diff>
--- a/docs/task2/ux/Team40-UX-Design-Validation.docx
+++ b/docs/task2/ux/Team40-UX-Design-Validation.docx
@@ -438,23 +438,7 @@
                 <w:sz w:val="19"/>
                 <w:szCs w:val="19"/>
               </w:rPr>
-              <w:t>1</w:t>
-            </w:r>
-            <w:r>
-              <w:rPr>
-                <w:color w:val="1E293B"/>
-                <w:sz w:val="19"/>
-                <w:szCs w:val="19"/>
-              </w:rPr>
-              <w:t>1</w:t>
-            </w:r>
-            <w:r>
-              <w:rPr>
-                <w:color w:val="1E293B"/>
-                <w:sz w:val="19"/>
-                <w:szCs w:val="19"/>
-              </w:rPr>
-              <w:t xml:space="preserve"> August 2026</w:t>
+              <w:t>10 August 2026</w:t>
             </w:r>
           </w:p>
         </w:tc>
@@ -711,7 +695,7 @@
           <w:sz w:val="21"/>
           <w:szCs w:val="21"/>
         </w:rPr>
-        <w:t>The Login Page has been redesigned visually while preserving every existing field, button, and link required by FR-01 to FR-07. The layout keeps the email field, password field, "Forgot password?" link, Sign In button, Google sign-in button, and account creation link in familiar, clearly labelled positions.</w:t>
+        <w:t>The Login Page has been redesigned visually while preserving every existing field, button, and link required by FR-01 to FR-07. The layout keeps the email field, password field, Sign In button, Google sign-in button, and account creation link in familiar, clearly labelled positions.</w:t>
       </w:r>
     </w:p>
     <w:p>
@@ -720,15 +704,672 @@
         <w:jc w:val="center"/>
       </w:pPr>
       <w:r>
-        <w:rPr>
-          <w:noProof/>
-        </w:rPr>
         <w:lastRenderedPageBreak/>
         <w:drawing>
-          <wp:inline distT="0" distB="0" distL="0" distR="0" wp14:anchorId="234ABE8F" wp14:editId="057D3E95">
-            <wp:extent cx="3619500" cy="3762375"/>
+          <wp:inline distT="0" distB="0" distL="0" distR="0" wp14:anchorId="00B74E5C" wp14:editId="03CE09A2">
+            <wp:extent cx="5943600" cy="3727450"/>
+            <wp:effectExtent l="0" t="0" r="0" b="6350"/>
+            <wp:docPr id="822461537" name="Picture 1"/>
+            <wp:cNvGraphicFramePr>
+              <a:graphicFrameLocks xmlns:a="http://schemas.openxmlformats.org/drawingml/2006/main" noChangeAspect="1"/>
+            </wp:cNvGraphicFramePr>
+            <a:graphic xmlns:a="http://schemas.openxmlformats.org/drawingml/2006/main">
+              <a:graphicData uri="http://schemas.openxmlformats.org/drawingml/2006/picture">
+                <pic:pic xmlns:pic="http://schemas.openxmlformats.org/drawingml/2006/picture">
+                  <pic:nvPicPr>
+                    <pic:cNvPr id="822461537" name=""/>
+                    <pic:cNvPicPr/>
+                  </pic:nvPicPr>
+                  <pic:blipFill>
+                    <a:blip r:embed="rId7"/>
+                    <a:stretch>
+                      <a:fillRect/>
+                    </a:stretch>
+                  </pic:blipFill>
+                  <pic:spPr>
+                    <a:xfrm>
+                      <a:off x="0" y="0"/>
+                      <a:ext cx="5943600" cy="3727450"/>
+                    </a:xfrm>
+                    <a:prstGeom prst="rect">
+                      <a:avLst/>
+                    </a:prstGeom>
+                  </pic:spPr>
+                </pic:pic>
+              </a:graphicData>
+            </a:graphic>
+          </wp:inline>
+        </w:drawing>
+      </w:r>
+    </w:p>
+    <w:p>
+      <w:pPr>
+        <w:spacing w:before="100" w:after="300"/>
+        <w:jc w:val="center"/>
+      </w:pPr>
+      <w:r>
+        <w:rPr>
+          <w:i/>
+          <w:iCs/>
+          <w:color w:val="64748B"/>
+          <w:sz w:val="19"/>
+          <w:szCs w:val="19"/>
+        </w:rPr>
+        <w:t>Fig. 1 — Styled Login Page (desktop). "Team 40" workspace branding, Google sign-in, and email/password fields with labels.</w:t>
+      </w:r>
+    </w:p>
+    <w:p>
+      <w:pPr>
+        <w:spacing w:after="160" w:line="300" w:lineRule="auto"/>
+      </w:pPr>
+      <w:r>
+        <w:rPr>
+          <w:color w:val="334155"/>
+          <w:sz w:val="21"/>
+          <w:szCs w:val="21"/>
+        </w:rPr>
+        <w:t>Design notes:</w:t>
+      </w:r>
+    </w:p>
+    <w:p>
+      <w:pPr>
+        <w:pStyle w:val="ListParagraph"/>
+        <w:numPr>
+          <w:ilvl w:val="0"/>
+          <w:numId w:val="2"/>
+        </w:numPr>
+        <w:spacing w:after="80"/>
+      </w:pPr>
+      <w:r>
+        <w:rPr>
+          <w:color w:val="334155"/>
+          <w:sz w:val="21"/>
+          <w:szCs w:val="21"/>
+        </w:rPr>
+        <w:t>EMAIL and PASSWORD fields carry visible, uppercase labels for clarity (supports NFR-02).</w:t>
+      </w:r>
+    </w:p>
+    <w:p>
+      <w:pPr>
+        <w:pStyle w:val="ListParagraph"/>
+        <w:numPr>
+          <w:ilvl w:val="0"/>
+          <w:numId w:val="2"/>
+        </w:numPr>
+        <w:spacing w:after="80"/>
+      </w:pPr>
+      <w:r>
+        <w:rPr>
+          <w:color w:val="334155"/>
+          <w:sz w:val="21"/>
+          <w:szCs w:val="21"/>
+        </w:rPr>
+        <w:t>The "Create one" account-creation link remains present and clearly separated from the primary action.</w:t>
+      </w:r>
+    </w:p>
+    <w:p>
+      <w:pPr>
+        <w:pStyle w:val="ListParagraph"/>
+        <w:numPr>
+          <w:ilvl w:val="0"/>
+          <w:numId w:val="2"/>
+        </w:numPr>
+        <w:spacing w:after="80"/>
+      </w:pPr>
+      <w:r>
+        <w:rPr>
+          <w:color w:val="334155"/>
+          <w:sz w:val="21"/>
+          <w:szCs w:val="21"/>
+        </w:rPr>
+        <w:t>The primary Sign In button uses high-contrast colour and full-width sizing for easy targeting on any device.</w:t>
+      </w:r>
+    </w:p>
+    <w:p>
+      <w:pPr>
+        <w:pStyle w:val="ListParagraph"/>
+        <w:numPr>
+          <w:ilvl w:val="0"/>
+          <w:numId w:val="2"/>
+        </w:numPr>
+        <w:spacing w:after="80"/>
+      </w:pPr>
+      <w:r>
+        <w:rPr>
+          <w:color w:val="334155"/>
+          <w:sz w:val="21"/>
+          <w:szCs w:val="21"/>
+        </w:rPr>
+        <w:t>A fully designed error state (Fig. 1b, below) shows exactly how validation/error messaging appears. Loading-state visuals have not been separately mocked up; existing loading behaviour is intended to be preserved unchanged and will be verified during implementation (FR-05).</w:t>
+      </w:r>
+    </w:p>
+    <w:p>
+      <w:pPr>
+        <w:pStyle w:val="Heading2"/>
+        <w:spacing w:before="300" w:after="140"/>
+      </w:pPr>
+      <w:r>
+        <w:rPr>
+          <w:b/>
+          <w:bCs/>
+          <w:color w:val="2563EB"/>
+          <w:sz w:val="24"/>
+          <w:szCs w:val="24"/>
+        </w:rPr>
+        <w:t>3.1 Error State</w:t>
+      </w:r>
+    </w:p>
+    <w:p>
+      <w:pPr>
+        <w:spacing w:after="160" w:line="300" w:lineRule="auto"/>
+      </w:pPr>
+      <w:r>
+        <w:rPr>
+          <w:color w:val="334155"/>
+          <w:sz w:val="21"/>
+          <w:szCs w:val="21"/>
+        </w:rPr>
+        <w:t xml:space="preserve">The </w:t>
+      </w:r>
+      <w:proofErr w:type="spellStart"/>
+      <w:r>
+        <w:rPr>
+          <w:color w:val="334155"/>
+          <w:sz w:val="21"/>
+          <w:szCs w:val="21"/>
+        </w:rPr>
+        <w:t>mockup</w:t>
+      </w:r>
+      <w:proofErr w:type="spellEnd"/>
+      <w:r>
+        <w:rPr>
+          <w:color w:val="334155"/>
+          <w:sz w:val="21"/>
+          <w:szCs w:val="21"/>
+        </w:rPr>
+        <w:t xml:space="preserve"> below shows the Login Page in its error state, satisfying FR-07 and EC-01: on an invalid login attempt, the user remains on the Login </w:t>
+      </w:r>
+      <w:proofErr w:type="gramStart"/>
+      <w:r>
+        <w:rPr>
+          <w:color w:val="334155"/>
+          <w:sz w:val="21"/>
+          <w:szCs w:val="21"/>
+        </w:rPr>
+        <w:t>Page</w:t>
+      </w:r>
+      <w:proofErr w:type="gramEnd"/>
+      <w:r>
+        <w:rPr>
+          <w:color w:val="334155"/>
+          <w:sz w:val="21"/>
+          <w:szCs w:val="21"/>
+        </w:rPr>
+        <w:t xml:space="preserve"> and a clear, styled error message is displayed rather than being silently redirected or shown a generic browser alert.</w:t>
+      </w:r>
+    </w:p>
+    <w:p>
+      <w:pPr>
+        <w:spacing w:before="200"/>
+        <w:jc w:val="center"/>
+      </w:pPr>
+      <w:r>
+        <w:lastRenderedPageBreak/>
+        <w:drawing>
+          <wp:inline distT="0" distB="0" distL="0" distR="0" wp14:anchorId="16A8B79B" wp14:editId="036128F5">
+            <wp:extent cx="5943600" cy="3666490"/>
             <wp:effectExtent l="0" t="0" r="0" b="0"/>
-            <wp:docPr id="1" name="Picture 1"/>
+            <wp:docPr id="2097594972" name="Picture 1"/>
+            <wp:cNvGraphicFramePr>
+              <a:graphicFrameLocks xmlns:a="http://schemas.openxmlformats.org/drawingml/2006/main" noChangeAspect="1"/>
+            </wp:cNvGraphicFramePr>
+            <a:graphic xmlns:a="http://schemas.openxmlformats.org/drawingml/2006/main">
+              <a:graphicData uri="http://schemas.openxmlformats.org/drawingml/2006/picture">
+                <pic:pic xmlns:pic="http://schemas.openxmlformats.org/drawingml/2006/picture">
+                  <pic:nvPicPr>
+                    <pic:cNvPr id="2097594972" name=""/>
+                    <pic:cNvPicPr/>
+                  </pic:nvPicPr>
+                  <pic:blipFill>
+                    <a:blip r:embed="rId8"/>
+                    <a:stretch>
+                      <a:fillRect/>
+                    </a:stretch>
+                  </pic:blipFill>
+                  <pic:spPr>
+                    <a:xfrm>
+                      <a:off x="0" y="0"/>
+                      <a:ext cx="5943600" cy="3666490"/>
+                    </a:xfrm>
+                    <a:prstGeom prst="rect">
+                      <a:avLst/>
+                    </a:prstGeom>
+                  </pic:spPr>
+                </pic:pic>
+              </a:graphicData>
+            </a:graphic>
+          </wp:inline>
+        </w:drawing>
+      </w:r>
+    </w:p>
+    <w:p>
+      <w:pPr>
+        <w:spacing w:before="100" w:after="300"/>
+        <w:jc w:val="center"/>
+      </w:pPr>
+      <w:r>
+        <w:rPr>
+          <w:i/>
+          <w:iCs/>
+          <w:color w:val="64748B"/>
+          <w:sz w:val="19"/>
+          <w:szCs w:val="19"/>
+        </w:rPr>
+        <w:t>Fig. 1b — Login Page, invalid-credentials error state. A soft red banner with red text — "Incorrect email or password. Please try again." — appears between the Password field and the Sign In button.</w:t>
+      </w:r>
+    </w:p>
+    <w:p>
+      <w:pPr>
+        <w:spacing w:after="160" w:line="300" w:lineRule="auto"/>
+      </w:pPr>
+      <w:r>
+        <w:rPr>
+          <w:color w:val="334155"/>
+          <w:sz w:val="21"/>
+          <w:szCs w:val="21"/>
+        </w:rPr>
+        <w:t>Design notes for the error state:</w:t>
+      </w:r>
+    </w:p>
+    <w:p>
+      <w:pPr>
+        <w:pStyle w:val="ListParagraph"/>
+        <w:numPr>
+          <w:ilvl w:val="0"/>
+          <w:numId w:val="2"/>
+        </w:numPr>
+        <w:spacing w:after="80"/>
+      </w:pPr>
+      <w:r>
+        <w:rPr>
+          <w:color w:val="334155"/>
+          <w:sz w:val="21"/>
+          <w:szCs w:val="21"/>
+        </w:rPr>
+        <w:t>The message uses a light red background with darker red text and rounded corners, matching the card and input styling already established elsewhere on the page — keeping the error visually consistent with NFR-03.</w:t>
+      </w:r>
+    </w:p>
+    <w:p>
+      <w:pPr>
+        <w:pStyle w:val="ListParagraph"/>
+        <w:numPr>
+          <w:ilvl w:val="0"/>
+          <w:numId w:val="2"/>
+        </w:numPr>
+        <w:spacing w:after="80"/>
+      </w:pPr>
+      <w:r>
+        <w:rPr>
+          <w:color w:val="334155"/>
+          <w:sz w:val="21"/>
+          <w:szCs w:val="21"/>
+        </w:rPr>
+        <w:t>The error banner sits directly below the fields being validated (email/password) and above the Sign In button, so it is immediately visible without scrolling.</w:t>
+      </w:r>
+    </w:p>
+    <w:p>
+      <w:pPr>
+        <w:pStyle w:val="ListParagraph"/>
+        <w:numPr>
+          <w:ilvl w:val="0"/>
+          <w:numId w:val="2"/>
+        </w:numPr>
+        <w:spacing w:after="80"/>
+      </w:pPr>
+      <w:r>
+        <w:rPr>
+          <w:color w:val="334155"/>
+          <w:sz w:val="21"/>
+          <w:szCs w:val="21"/>
+        </w:rPr>
+        <w:t xml:space="preserve">Copy is </w:t>
+      </w:r>
+      <w:proofErr w:type="gramStart"/>
+      <w:r>
+        <w:rPr>
+          <w:color w:val="334155"/>
+          <w:sz w:val="21"/>
+          <w:szCs w:val="21"/>
+        </w:rPr>
+        <w:t>plain-language</w:t>
+      </w:r>
+      <w:proofErr w:type="gramEnd"/>
+      <w:r>
+        <w:rPr>
+          <w:color w:val="334155"/>
+          <w:sz w:val="21"/>
+          <w:szCs w:val="21"/>
+        </w:rPr>
+        <w:t xml:space="preserve"> ("Incorrect email or password. Please try again.") rather than a technical/system-level error, so it remains clear to any user.</w:t>
+      </w:r>
+    </w:p>
+    <w:p>
+      <w:pPr>
+        <w:pStyle w:val="ListParagraph"/>
+        <w:numPr>
+          <w:ilvl w:val="0"/>
+          <w:numId w:val="2"/>
+        </w:numPr>
+        <w:spacing w:after="80"/>
+      </w:pPr>
+      <w:r>
+        <w:rPr>
+          <w:color w:val="334155"/>
+          <w:sz w:val="21"/>
+          <w:szCs w:val="21"/>
+        </w:rPr>
+        <w:t xml:space="preserve">This </w:t>
+      </w:r>
+      <w:proofErr w:type="spellStart"/>
+      <w:r>
+        <w:rPr>
+          <w:color w:val="334155"/>
+          <w:sz w:val="21"/>
+          <w:szCs w:val="21"/>
+        </w:rPr>
+        <w:t>mockup</w:t>
+      </w:r>
+      <w:proofErr w:type="spellEnd"/>
+      <w:r>
+        <w:rPr>
+          <w:color w:val="334155"/>
+          <w:sz w:val="21"/>
+          <w:szCs w:val="21"/>
+        </w:rPr>
+        <w:t xml:space="preserve"> illustrates the error state only. Whether the email/password fields are cleared or retained after a failed attempt is existing application behaviour, not something newly defined by this design — the BA requirements do not specify it, and it is intentionally left unchanged rather than introduced as a new UX decision.</w:t>
+      </w:r>
+    </w:p>
+    <w:p>
+      <w:pPr>
+        <w:pStyle w:val="Heading1"/>
+        <w:pBdr>
+          <w:bottom w:val="single" w:sz="6" w:space="4" w:color="2563EB"/>
+        </w:pBdr>
+        <w:spacing w:before="400" w:after="200"/>
+      </w:pPr>
+      <w:r>
+        <w:rPr>
+          <w:b/>
+          <w:bCs/>
+          <w:color w:val="1E293B"/>
+          <w:sz w:val="30"/>
+          <w:szCs w:val="30"/>
+        </w:rPr>
+        <w:t>4. Team Page Design</w:t>
+      </w:r>
+    </w:p>
+    <w:p>
+      <w:pPr>
+        <w:spacing w:after="160" w:line="300" w:lineRule="auto"/>
+      </w:pPr>
+      <w:r>
+        <w:rPr>
+          <w:color w:val="334155"/>
+          <w:sz w:val="21"/>
+          <w:szCs w:val="21"/>
+        </w:rPr>
+        <w:t>The Team Page introduces "Team 40" with a card for each of the four team members, satisfying FR-12 through FR-16 and the field/display rules in Section 5 of the BA requirements.</w:t>
+      </w:r>
+    </w:p>
+    <w:p>
+      <w:pPr>
+        <w:spacing w:before="200"/>
+        <w:jc w:val="center"/>
+      </w:pPr>
+      <w:r>
+        <w:lastRenderedPageBreak/>
+        <w:drawing>
+          <wp:inline distT="0" distB="0" distL="0" distR="0" wp14:anchorId="6F8D15E3" wp14:editId="304472B0">
+            <wp:extent cx="5943600" cy="3616325"/>
+            <wp:effectExtent l="0" t="0" r="0" b="3175"/>
+            <wp:docPr id="856823890" name="Picture 1"/>
+            <wp:cNvGraphicFramePr>
+              <a:graphicFrameLocks xmlns:a="http://schemas.openxmlformats.org/drawingml/2006/main" noChangeAspect="1"/>
+            </wp:cNvGraphicFramePr>
+            <a:graphic xmlns:a="http://schemas.openxmlformats.org/drawingml/2006/main">
+              <a:graphicData uri="http://schemas.openxmlformats.org/drawingml/2006/picture">
+                <pic:pic xmlns:pic="http://schemas.openxmlformats.org/drawingml/2006/picture">
+                  <pic:nvPicPr>
+                    <pic:cNvPr id="856823890" name=""/>
+                    <pic:cNvPicPr/>
+                  </pic:nvPicPr>
+                  <pic:blipFill>
+                    <a:blip r:embed="rId9"/>
+                    <a:stretch>
+                      <a:fillRect/>
+                    </a:stretch>
+                  </pic:blipFill>
+                  <pic:spPr>
+                    <a:xfrm>
+                      <a:off x="0" y="0"/>
+                      <a:ext cx="5943600" cy="3616325"/>
+                    </a:xfrm>
+                    <a:prstGeom prst="rect">
+                      <a:avLst/>
+                    </a:prstGeom>
+                  </pic:spPr>
+                </pic:pic>
+              </a:graphicData>
+            </a:graphic>
+          </wp:inline>
+        </w:drawing>
+      </w:r>
+    </w:p>
+    <w:p>
+      <w:pPr>
+        <w:spacing w:before="100" w:after="300"/>
+        <w:jc w:val="center"/>
+      </w:pPr>
+      <w:r>
+        <w:rPr>
+          <w:i/>
+          <w:iCs/>
+          <w:color w:val="64748B"/>
+          <w:sz w:val="19"/>
+          <w:szCs w:val="19"/>
+        </w:rPr>
+        <w:t>Fig. 2 — Team Page (desktop). Four member cards, each with avatar, name, role badge, and blurb.</w:t>
+      </w:r>
+    </w:p>
+    <w:p>
+      <w:pPr>
+        <w:spacing w:after="160" w:line="300" w:lineRule="auto"/>
+      </w:pPr>
+      <w:r>
+        <w:rPr>
+          <w:color w:val="334155"/>
+          <w:sz w:val="21"/>
+          <w:szCs w:val="21"/>
+        </w:rPr>
+        <w:t>Field and display rule mapping:</w:t>
+      </w:r>
+    </w:p>
+    <w:p>
+      <w:pPr>
+        <w:pStyle w:val="ListParagraph"/>
+        <w:numPr>
+          <w:ilvl w:val="0"/>
+          <w:numId w:val="2"/>
+        </w:numPr>
+        <w:spacing w:after="80"/>
+      </w:pPr>
+      <w:r>
+        <w:rPr>
+          <w:color w:val="334155"/>
+          <w:sz w:val="21"/>
+          <w:szCs w:val="21"/>
+        </w:rPr>
+        <w:t>Team Name — "Meet Team 40" is displayed prominently as the page headline, with "Team 40" repeated in the persistent top-left header.</w:t>
+      </w:r>
+    </w:p>
+    <w:p>
+      <w:pPr>
+        <w:pStyle w:val="ListParagraph"/>
+        <w:numPr>
+          <w:ilvl w:val="0"/>
+          <w:numId w:val="2"/>
+        </w:numPr>
+        <w:spacing w:after="80"/>
+      </w:pPr>
+      <w:r>
+        <w:rPr>
+          <w:color w:val="334155"/>
+          <w:sz w:val="21"/>
+          <w:szCs w:val="21"/>
+        </w:rPr>
+        <w:t>Member Photo — represented with a coloured monogram avatar (initials) per member, serving as the consistent placeholder avatar required by EC-04 in the absence of uploaded photos.</w:t>
+      </w:r>
+    </w:p>
+    <w:p>
+      <w:pPr>
+        <w:pStyle w:val="ListParagraph"/>
+        <w:numPr>
+          <w:ilvl w:val="0"/>
+          <w:numId w:val="2"/>
+        </w:numPr>
+        <w:spacing w:after="80"/>
+      </w:pPr>
+      <w:r>
+        <w:rPr>
+          <w:color w:val="334155"/>
+          <w:sz w:val="21"/>
+          <w:szCs w:val="21"/>
+        </w:rPr>
+        <w:t>Member Name — each card displays the member’s full name in bold, unabbreviated.</w:t>
+      </w:r>
+    </w:p>
+    <w:p>
+      <w:pPr>
+        <w:pStyle w:val="ListParagraph"/>
+        <w:numPr>
+          <w:ilvl w:val="0"/>
+          <w:numId w:val="2"/>
+        </w:numPr>
+        <w:spacing w:after="80"/>
+      </w:pPr>
+      <w:r>
+        <w:rPr>
+          <w:color w:val="334155"/>
+          <w:sz w:val="21"/>
+          <w:szCs w:val="21"/>
+        </w:rPr>
+        <w:t>Member Role — each card shows a coloured role badge: PM, DEV, UX, and BA respectively.</w:t>
+      </w:r>
+    </w:p>
+    <w:p>
+      <w:pPr>
+        <w:pStyle w:val="ListParagraph"/>
+        <w:numPr>
+          <w:ilvl w:val="0"/>
+          <w:numId w:val="2"/>
+        </w:numPr>
+        <w:spacing w:after="80"/>
+      </w:pPr>
+      <w:r>
+        <w:rPr>
+          <w:color w:val="334155"/>
+          <w:sz w:val="21"/>
+          <w:szCs w:val="21"/>
+        </w:rPr>
+        <w:t>Member Blurb — each card includes a short, role-relevant blurb; the card layout accommodates the varying blurb lengths visible across the four members without breaking alignment (EC-05).</w:t>
+      </w:r>
+    </w:p>
+    <w:p>
+      <w:pPr>
+        <w:pStyle w:val="ListParagraph"/>
+        <w:numPr>
+          <w:ilvl w:val="0"/>
+          <w:numId w:val="2"/>
+        </w:numPr>
+        <w:spacing w:after="80"/>
+      </w:pPr>
+      <w:r>
+        <w:rPr>
+          <w:color w:val="334155"/>
+          <w:sz w:val="21"/>
+          <w:szCs w:val="21"/>
+        </w:rPr>
+        <w:t>Member Card / Section — each member’s photo, name, role, and blurb are grouped within one clearly bordered card, satisfying the grouping requirement in Section 5.</w:t>
+      </w:r>
+    </w:p>
+    <w:p>
+      <w:r>
+        <w:br w:type="page"/>
+      </w:r>
+    </w:p>
+    <w:p>
+      <w:pPr>
+        <w:pStyle w:val="Heading1"/>
+        <w:pBdr>
+          <w:bottom w:val="single" w:sz="6" w:space="4" w:color="2563EB"/>
+        </w:pBdr>
+        <w:spacing w:before="400" w:after="200"/>
+      </w:pPr>
+      <w:r>
+        <w:rPr>
+          <w:b/>
+          <w:bCs/>
+          <w:color w:val="1E293B"/>
+          <w:sz w:val="30"/>
+          <w:szCs w:val="30"/>
+        </w:rPr>
+        <w:lastRenderedPageBreak/>
+        <w:t>5. Responsive Behaviour</w:t>
+      </w:r>
+    </w:p>
+    <w:p>
+      <w:pPr>
+        <w:spacing w:after="160" w:line="300" w:lineRule="auto"/>
+      </w:pPr>
+      <w:r>
+        <w:rPr>
+          <w:color w:val="334155"/>
+          <w:sz w:val="21"/>
+          <w:szCs w:val="21"/>
+        </w:rPr>
+        <w:t>The design has been validated at three breakpoints — desktop, tablet, and mobile — to satisfy NFR-01 and EC-06.</w:t>
+      </w:r>
+    </w:p>
+    <w:p>
+      <w:pPr>
+        <w:pStyle w:val="Heading2"/>
+        <w:spacing w:before="300" w:after="140"/>
+      </w:pPr>
+      <w:r>
+        <w:rPr>
+          <w:b/>
+          <w:bCs/>
+          <w:color w:val="2563EB"/>
+          <w:sz w:val="24"/>
+          <w:szCs w:val="24"/>
+        </w:rPr>
+        <w:t>5.1 Tablet view</w:t>
+      </w:r>
+    </w:p>
+    <w:p>
+      <w:pPr>
+        <w:spacing w:before="200"/>
+        <w:jc w:val="center"/>
+      </w:pPr>
+      <w:r>
+        <w:rPr>
+          <w:noProof/>
+        </w:rPr>
+        <w:drawing>
+          <wp:inline distT="0" distB="0" distL="0" distR="0" wp14:anchorId="6000CDC2" wp14:editId="19E26B8A">
+            <wp:extent cx="3238500" cy="4162425"/>
+            <wp:effectExtent l="0" t="0" r="0" b="0"/>
+            <wp:docPr id="1004525129" name="Picture 1004525129"/>
             <wp:cNvGraphicFramePr>
               <a:graphicFrameLocks xmlns:a="http://schemas.openxmlformats.org/drawingml/2006/main" noChangeAspect="1"/>
             </wp:cNvGraphicFramePr>
@@ -742,7 +1383,7 @@
                     </pic:cNvPicPr>
                   </pic:nvPicPr>
                   <pic:blipFill>
-                    <a:blip r:embed="rId7"/>
+                    <a:blip r:embed="rId10"/>
                     <a:srcRect/>
                     <a:stretch>
                       <a:fillRect/>
@@ -751,7 +1392,7 @@
                   <pic:spPr bwMode="auto">
                     <a:xfrm>
                       <a:off x="0" y="0"/>
-                      <a:ext cx="3619500" cy="3762375"/>
+                      <a:ext cx="3238500" cy="4162425"/>
                     </a:xfrm>
                     <a:prstGeom prst="rect">
                       <a:avLst/>
@@ -777,92 +1418,7 @@
           <w:sz w:val="19"/>
           <w:szCs w:val="19"/>
         </w:rPr>
-        <w:t>Fig. 1 — Styled Login Page (desktop). "Team 40" workspace branding, Google sign-in, and email/password fields with labels.</w:t>
-      </w:r>
-    </w:p>
-    <w:p>
-      <w:pPr>
-        <w:spacing w:after="160" w:line="300" w:lineRule="auto"/>
-      </w:pPr>
-      <w:r>
-        <w:rPr>
-          <w:color w:val="334155"/>
-          <w:sz w:val="21"/>
-          <w:szCs w:val="21"/>
-        </w:rPr>
-        <w:t>Design notes:</w:t>
-      </w:r>
-    </w:p>
-    <w:p>
-      <w:pPr>
-        <w:pStyle w:val="ListParagraph"/>
-        <w:numPr>
-          <w:ilvl w:val="0"/>
-          <w:numId w:val="2"/>
-        </w:numPr>
-        <w:spacing w:after="80"/>
-      </w:pPr>
-      <w:r>
-        <w:rPr>
-          <w:color w:val="334155"/>
-          <w:sz w:val="21"/>
-          <w:szCs w:val="21"/>
-        </w:rPr>
-        <w:t>EMAIL and PASSWORD fields carry visible, uppercase labels for clarity (supports NFR-02).</w:t>
-      </w:r>
-    </w:p>
-    <w:p>
-      <w:pPr>
-        <w:pStyle w:val="ListParagraph"/>
-        <w:numPr>
-          <w:ilvl w:val="0"/>
-          <w:numId w:val="2"/>
-        </w:numPr>
-        <w:spacing w:after="80"/>
-      </w:pPr>
-      <w:r>
-        <w:rPr>
-          <w:color w:val="334155"/>
-          <w:sz w:val="21"/>
-          <w:szCs w:val="21"/>
-        </w:rPr>
-        <w:t>The "Forgot password?" link and "Create one" account-creation link remain present and clearly separated from the primary action.</w:t>
-      </w:r>
-    </w:p>
-    <w:p>
-      <w:pPr>
-        <w:pStyle w:val="ListParagraph"/>
-        <w:numPr>
-          <w:ilvl w:val="0"/>
-          <w:numId w:val="2"/>
-        </w:numPr>
-        <w:spacing w:after="80"/>
-      </w:pPr>
-      <w:r>
-        <w:rPr>
-          <w:color w:val="334155"/>
-          <w:sz w:val="21"/>
-          <w:szCs w:val="21"/>
-        </w:rPr>
-        <w:t>The primary Sign In button uses high-contrast colour and full-width sizing for easy targeting on any device.</w:t>
-      </w:r>
-    </w:p>
-    <w:p>
-      <w:pPr>
-        <w:pStyle w:val="ListParagraph"/>
-        <w:numPr>
-          <w:ilvl w:val="0"/>
-          <w:numId w:val="2"/>
-        </w:numPr>
-        <w:spacing w:after="80"/>
-      </w:pPr>
-      <w:r>
-        <w:rPr>
-          <w:color w:val="334155"/>
-          <w:sz w:val="21"/>
-          <w:szCs w:val="21"/>
-        </w:rPr>
-        <w:t>A fully designed error state (Fig. 1b, below) shows exactly how validation/error messaging appears, so existing error and loading states continue to display correctly (FR-05, EC-01, EC-08).</w:t>
+        <w:t>Fig. 3 — Team Page at tablet width. Cards reflow into a 2-column grid; all card content remains fully readable.</w:t>
       </w:r>
     </w:p>
     <w:p>
@@ -878,7 +1434,7 @@
           <w:sz w:val="24"/>
           <w:szCs w:val="24"/>
         </w:rPr>
-        <w:t>3.1 Error State</w:t>
+        <w:t>5.2 Mobile view</w:t>
       </w:r>
     </w:p>
     <w:p>
@@ -891,43 +1447,7 @@
           <w:sz w:val="21"/>
           <w:szCs w:val="21"/>
         </w:rPr>
-        <w:t xml:space="preserve">The </w:t>
-      </w:r>
-      <w:proofErr w:type="spellStart"/>
-      <w:r>
-        <w:rPr>
-          <w:color w:val="334155"/>
-          <w:sz w:val="21"/>
-          <w:szCs w:val="21"/>
-        </w:rPr>
-        <w:t>mockup</w:t>
-      </w:r>
-      <w:proofErr w:type="spellEnd"/>
-      <w:r>
-        <w:rPr>
-          <w:color w:val="334155"/>
-          <w:sz w:val="21"/>
-          <w:szCs w:val="21"/>
-        </w:rPr>
-        <w:t xml:space="preserve"> below shows the Login Page in its error state, satisfying FR-07 and EC-01: on an invalid login attempt, the user remains on the Login </w:t>
-      </w:r>
-      <w:proofErr w:type="gramStart"/>
-      <w:r>
-        <w:rPr>
-          <w:color w:val="334155"/>
-          <w:sz w:val="21"/>
-          <w:szCs w:val="21"/>
-        </w:rPr>
-        <w:t>Page</w:t>
-      </w:r>
-      <w:proofErr w:type="gramEnd"/>
-      <w:r>
-        <w:rPr>
-          <w:color w:val="334155"/>
-          <w:sz w:val="21"/>
-          <w:szCs w:val="21"/>
-        </w:rPr>
-        <w:t xml:space="preserve"> and a clear, styled error message is displayed rather than being silently redirected or shown a generic browser alert.</w:t>
+        <w:t>On mobile, the card grid collapses to a single column so no content overlaps or overflows, and every card remains fully legible without horizontal scrolling.</w:t>
       </w:r>
     </w:p>
     <w:p>
@@ -941,10 +1461,10 @@
         </w:rPr>
         <w:lastRenderedPageBreak/>
         <w:drawing>
-          <wp:inline distT="0" distB="0" distL="0" distR="0" wp14:anchorId="30D68A4F" wp14:editId="3184CAAC">
-            <wp:extent cx="3619500" cy="2924175"/>
+          <wp:inline distT="0" distB="0" distL="0" distR="0" wp14:anchorId="1E443B5E" wp14:editId="3AA63B66">
+            <wp:extent cx="2476500" cy="4981575"/>
             <wp:effectExtent l="0" t="0" r="0" b="0"/>
-            <wp:docPr id="2086023872" name="Picture 2086023872"/>
+            <wp:docPr id="273675062" name="Picture 273675062"/>
             <wp:cNvGraphicFramePr>
               <a:graphicFrameLocks xmlns:a="http://schemas.openxmlformats.org/drawingml/2006/main" noChangeAspect="1"/>
             </wp:cNvGraphicFramePr>
@@ -958,7 +1478,7 @@
                     </pic:cNvPicPr>
                   </pic:nvPicPr>
                   <pic:blipFill>
-                    <a:blip r:embed="rId8"/>
+                    <a:blip r:embed="rId11"/>
                     <a:srcRect/>
                     <a:stretch>
                       <a:fillRect/>
@@ -967,7 +1487,7 @@
                   <pic:spPr bwMode="auto">
                     <a:xfrm>
                       <a:off x="0" y="0"/>
-                      <a:ext cx="3619500" cy="2924175"/>
+                      <a:ext cx="2476500" cy="4981575"/>
                     </a:xfrm>
                     <a:prstGeom prst="rect">
                       <a:avLst/>
@@ -993,142 +1513,7 @@
           <w:sz w:val="19"/>
           <w:szCs w:val="19"/>
         </w:rPr>
-        <w:t>Fig. 1b — Login Page, invalid-credentials error state. A soft red banner with red text — "Incorrect email or password. Please try again." — appears between the Password field and the Sign In button.</w:t>
-      </w:r>
-    </w:p>
-    <w:p>
-      <w:pPr>
-        <w:spacing w:after="160" w:line="300" w:lineRule="auto"/>
-      </w:pPr>
-      <w:r>
-        <w:rPr>
-          <w:color w:val="334155"/>
-          <w:sz w:val="21"/>
-          <w:szCs w:val="21"/>
-        </w:rPr>
-        <w:t>Design notes for the error state:</w:t>
-      </w:r>
-    </w:p>
-    <w:p>
-      <w:pPr>
-        <w:pStyle w:val="ListParagraph"/>
-        <w:numPr>
-          <w:ilvl w:val="0"/>
-          <w:numId w:val="2"/>
-        </w:numPr>
-        <w:spacing w:after="80"/>
-      </w:pPr>
-      <w:r>
-        <w:rPr>
-          <w:color w:val="334155"/>
-          <w:sz w:val="21"/>
-          <w:szCs w:val="21"/>
-        </w:rPr>
-        <w:t>The message uses a light red background with darker red text and rounded corners, matching the card and input styling already established elsewhere on the page — keeping the error visually consistent with NFR-03.</w:t>
-      </w:r>
-    </w:p>
-    <w:p>
-      <w:pPr>
-        <w:pStyle w:val="ListParagraph"/>
-        <w:numPr>
-          <w:ilvl w:val="0"/>
-          <w:numId w:val="2"/>
-        </w:numPr>
-        <w:spacing w:after="80"/>
-      </w:pPr>
-      <w:r>
-        <w:rPr>
-          <w:color w:val="334155"/>
-          <w:sz w:val="21"/>
-          <w:szCs w:val="21"/>
-        </w:rPr>
-        <w:t>The error banner sits directly below the fields being validated (email/password) and above the Sign In button, so it is immediately visible without scrolling.</w:t>
-      </w:r>
-    </w:p>
-    <w:p>
-      <w:pPr>
-        <w:pStyle w:val="ListParagraph"/>
-        <w:numPr>
-          <w:ilvl w:val="0"/>
-          <w:numId w:val="2"/>
-        </w:numPr>
-        <w:spacing w:after="80"/>
-      </w:pPr>
-      <w:r>
-        <w:rPr>
-          <w:color w:val="334155"/>
-          <w:sz w:val="21"/>
-          <w:szCs w:val="21"/>
-        </w:rPr>
-        <w:t xml:space="preserve">Copy is </w:t>
-      </w:r>
-      <w:proofErr w:type="gramStart"/>
-      <w:r>
-        <w:rPr>
-          <w:color w:val="334155"/>
-          <w:sz w:val="21"/>
-          <w:szCs w:val="21"/>
-        </w:rPr>
-        <w:t>plain-language</w:t>
-      </w:r>
-      <w:proofErr w:type="gramEnd"/>
-      <w:r>
-        <w:rPr>
-          <w:color w:val="334155"/>
-          <w:sz w:val="21"/>
-          <w:szCs w:val="21"/>
-        </w:rPr>
-        <w:t xml:space="preserve"> ("Incorrect email or password. Please try again.") rather than a technical/system-level error, so it remains clear to any user.</w:t>
-      </w:r>
-    </w:p>
-    <w:p>
-      <w:pPr>
-        <w:pStyle w:val="ListParagraph"/>
-        <w:numPr>
-          <w:ilvl w:val="0"/>
-          <w:numId w:val="2"/>
-        </w:numPr>
-        <w:spacing w:after="80"/>
-      </w:pPr>
-      <w:r>
-        <w:rPr>
-          <w:color w:val="334155"/>
-          <w:sz w:val="21"/>
-          <w:szCs w:val="21"/>
-        </w:rPr>
-        <w:t>The email and password fields remain populated with the user’s entered values after a failed attempt (not cleared), so the user does not have to retype everything — consistent with EC-01’s requirement that the user "remain on the Login Page."</w:t>
-      </w:r>
-    </w:p>
-    <w:p>
-      <w:pPr>
-        <w:pStyle w:val="Heading1"/>
-        <w:pBdr>
-          <w:bottom w:val="single" w:sz="6" w:space="4" w:color="2563EB"/>
-        </w:pBdr>
-        <w:spacing w:before="400" w:after="200"/>
-      </w:pPr>
-      <w:r>
-        <w:rPr>
-          <w:b/>
-          <w:bCs/>
-          <w:color w:val="1E293B"/>
-          <w:sz w:val="30"/>
-          <w:szCs w:val="30"/>
-        </w:rPr>
-        <w:t>4. Team Page Design</w:t>
-      </w:r>
-    </w:p>
-    <w:p>
-      <w:pPr>
-        <w:spacing w:after="160" w:line="300" w:lineRule="auto"/>
-      </w:pPr>
-      <w:r>
-        <w:rPr>
-          <w:color w:val="334155"/>
-          <w:sz w:val="21"/>
-          <w:szCs w:val="21"/>
-        </w:rPr>
-        <w:t>The Team Page introduces "Team 40" with a card for each of the four team members, satisfying FR-12 through FR-16 and the field/display rules in Section 5 of the BA requirements.</w:t>
+        <w:t>Fig. 4 — Mobile view (top of page): header, hero copy, and first two member cards in single-column layout.</w:t>
       </w:r>
     </w:p>
     <w:p>
@@ -1142,10 +1527,10 @@
         </w:rPr>
         <w:lastRenderedPageBreak/>
         <w:drawing>
-          <wp:inline distT="0" distB="0" distL="0" distR="0" wp14:anchorId="4E5FF762" wp14:editId="52A24EB4">
-            <wp:extent cx="4953000" cy="3067050"/>
+          <wp:inline distT="0" distB="0" distL="0" distR="0" wp14:anchorId="16417F04" wp14:editId="69B27073">
+            <wp:extent cx="2476500" cy="4972050"/>
             <wp:effectExtent l="0" t="0" r="0" b="0"/>
-            <wp:docPr id="2123859238" name="Picture 2123859238"/>
+            <wp:docPr id="621285833" name="Picture 621285833"/>
             <wp:cNvGraphicFramePr>
               <a:graphicFrameLocks xmlns:a="http://schemas.openxmlformats.org/drawingml/2006/main" noChangeAspect="1"/>
             </wp:cNvGraphicFramePr>
@@ -1159,7 +1544,7 @@
                     </pic:cNvPicPr>
                   </pic:nvPicPr>
                   <pic:blipFill>
-                    <a:blip r:embed="rId9"/>
+                    <a:blip r:embed="rId12"/>
                     <a:srcRect/>
                     <a:stretch>
                       <a:fillRect/>
@@ -1168,7 +1553,7 @@
                   <pic:spPr bwMode="auto">
                     <a:xfrm>
                       <a:off x="0" y="0"/>
-                      <a:ext cx="4953000" cy="3067050"/>
+                      <a:ext cx="2476500" cy="4972050"/>
                     </a:xfrm>
                     <a:prstGeom prst="rect">
                       <a:avLst/>
@@ -1194,7 +1579,32 @@
           <w:sz w:val="19"/>
           <w:szCs w:val="19"/>
         </w:rPr>
-        <w:t>Fig. 2 — Team Page (desktop). Four member cards, each with avatar, name, role badge, and blurb.</w:t>
+        <w:t>Fig. 5 — Mobile view (continued): remaining member cards, confirming consistent single-column card treatment.</w:t>
+      </w:r>
+    </w:p>
+    <w:p>
+      <w:r>
+        <w:br w:type="page"/>
+      </w:r>
+    </w:p>
+    <w:p>
+      <w:pPr>
+        <w:pStyle w:val="Heading1"/>
+        <w:pBdr>
+          <w:bottom w:val="single" w:sz="6" w:space="4" w:color="2563EB"/>
+        </w:pBdr>
+        <w:spacing w:before="400" w:after="200"/>
+      </w:pPr>
+      <w:r>
+        <w:rPr>
+          <w:b/>
+          <w:bCs/>
+          <w:color w:val="1E293B"/>
+          <w:sz w:val="30"/>
+          <w:szCs w:val="30"/>
+        </w:rPr>
+        <w:lastRenderedPageBreak/>
+        <w:t>6. Requirements Traceability — Functional Requirements</w:t>
       </w:r>
     </w:p>
     <w:p>
@@ -1207,7 +1617,7 @@
           <w:sz w:val="21"/>
           <w:szCs w:val="21"/>
         </w:rPr>
-        <w:t>Field and display rule mapping:</w:t>
+        <w:t>The table below maps every functional requirement from the BA document to the specific design evidence in this deliverable. Status reflects what can genuinely be confirmed at the UX design stage — items that depend on implementation or further confirmation are marked accordingly rather than as fully addressed.</w:t>
       </w:r>
     </w:p>
     <w:p>
@@ -1225,7 +1635,7 @@
           <w:sz w:val="21"/>
           <w:szCs w:val="21"/>
         </w:rPr>
-        <w:t>Team Name — "Meet Team 40" is displayed prominently as the page headline, with "Team 40" repeated in the persistent top-left header.</w:t>
+        <w:t>Green — Addressed: fully satisfied by this design.</w:t>
       </w:r>
     </w:p>
     <w:p>
@@ -1243,7 +1653,7 @@
           <w:sz w:val="21"/>
           <w:szCs w:val="21"/>
         </w:rPr>
-        <w:t>Member Photo — represented with a coloured monogram avatar (initials) per member, serving as the consistent placeholder avatar required by EC-04 in the absence of uploaded photos.</w:t>
+        <w:t>Amber — Design supports the requirement, but full confirmation depends on implementation, Dev, or further team input.</w:t>
       </w:r>
     </w:p>
     <w:p>
@@ -1261,409 +1671,7 @@
           <w:sz w:val="21"/>
           <w:szCs w:val="21"/>
         </w:rPr>
-        <w:t>Member Name — each card displays the member’s full name in bold, unabbreviated.</w:t>
-      </w:r>
-    </w:p>
-    <w:p>
-      <w:pPr>
-        <w:pStyle w:val="ListParagraph"/>
-        <w:numPr>
-          <w:ilvl w:val="0"/>
-          <w:numId w:val="2"/>
-        </w:numPr>
-        <w:spacing w:after="80"/>
-      </w:pPr>
-      <w:r>
-        <w:rPr>
-          <w:color w:val="334155"/>
-          <w:sz w:val="21"/>
-          <w:szCs w:val="21"/>
-        </w:rPr>
-        <w:t>Member Role — each card shows a coloured role badge: PM, DEV, UX, and BA respectively.</w:t>
-      </w:r>
-    </w:p>
-    <w:p>
-      <w:pPr>
-        <w:pStyle w:val="ListParagraph"/>
-        <w:numPr>
-          <w:ilvl w:val="0"/>
-          <w:numId w:val="2"/>
-        </w:numPr>
-        <w:spacing w:after="80"/>
-      </w:pPr>
-      <w:r>
-        <w:rPr>
-          <w:color w:val="334155"/>
-          <w:sz w:val="21"/>
-          <w:szCs w:val="21"/>
-        </w:rPr>
-        <w:t>Member Blurb — each card includes a short, role-relevant blurb; the card layout accommodates the varying blurb lengths visible across the four members without breaking alignment (EC-05).</w:t>
-      </w:r>
-    </w:p>
-    <w:p>
-      <w:pPr>
-        <w:pStyle w:val="ListParagraph"/>
-        <w:numPr>
-          <w:ilvl w:val="0"/>
-          <w:numId w:val="2"/>
-        </w:numPr>
-        <w:spacing w:after="80"/>
-      </w:pPr>
-      <w:r>
-        <w:rPr>
-          <w:color w:val="334155"/>
-          <w:sz w:val="21"/>
-          <w:szCs w:val="21"/>
-        </w:rPr>
-        <w:t>Member Card / Section — each member’s photo, name, role, and blurb are grouped within one clearly bordered card, satisfying the grouping requirement in Section 5.</w:t>
-      </w:r>
-    </w:p>
-    <w:p>
-      <w:r>
-        <w:br w:type="page"/>
-      </w:r>
-    </w:p>
-    <w:p>
-      <w:pPr>
-        <w:pStyle w:val="Heading1"/>
-        <w:pBdr>
-          <w:bottom w:val="single" w:sz="6" w:space="4" w:color="2563EB"/>
-        </w:pBdr>
-        <w:spacing w:before="400" w:after="200"/>
-      </w:pPr>
-      <w:r>
-        <w:rPr>
-          <w:b/>
-          <w:bCs/>
-          <w:color w:val="1E293B"/>
-          <w:sz w:val="30"/>
-          <w:szCs w:val="30"/>
-        </w:rPr>
-        <w:lastRenderedPageBreak/>
-        <w:t>5. Responsive Behaviour</w:t>
-      </w:r>
-    </w:p>
-    <w:p>
-      <w:pPr>
-        <w:spacing w:after="160" w:line="300" w:lineRule="auto"/>
-      </w:pPr>
-      <w:r>
-        <w:rPr>
-          <w:color w:val="334155"/>
-          <w:sz w:val="21"/>
-          <w:szCs w:val="21"/>
-        </w:rPr>
-        <w:t>The design has been validated at three breakpoints — desktop, tablet, and mobile — to satisfy NFR-01 and EC-06.</w:t>
-      </w:r>
-    </w:p>
-    <w:p>
-      <w:pPr>
-        <w:pStyle w:val="Heading2"/>
-        <w:spacing w:before="300" w:after="140"/>
-      </w:pPr>
-      <w:r>
-        <w:rPr>
-          <w:b/>
-          <w:bCs/>
-          <w:color w:val="2563EB"/>
-          <w:sz w:val="24"/>
-          <w:szCs w:val="24"/>
-        </w:rPr>
-        <w:t>5.1 Tablet view</w:t>
-      </w:r>
-    </w:p>
-    <w:p>
-      <w:pPr>
-        <w:spacing w:before="200"/>
-        <w:jc w:val="center"/>
-      </w:pPr>
-      <w:r>
-        <w:rPr>
-          <w:noProof/>
-        </w:rPr>
-        <w:drawing>
-          <wp:inline distT="0" distB="0" distL="0" distR="0" wp14:anchorId="299FA30D" wp14:editId="56A6BF30">
-            <wp:extent cx="5207755" cy="6692900"/>
-            <wp:effectExtent l="0" t="0" r="0" b="0"/>
-            <wp:docPr id="220156891" name="Picture 1"/>
-            <wp:cNvGraphicFramePr>
-              <a:graphicFrameLocks xmlns:a="http://schemas.openxmlformats.org/drawingml/2006/main" noChangeAspect="1"/>
-            </wp:cNvGraphicFramePr>
-            <a:graphic xmlns:a="http://schemas.openxmlformats.org/drawingml/2006/main">
-              <a:graphicData uri="http://schemas.openxmlformats.org/drawingml/2006/picture">
-                <pic:pic xmlns:pic="http://schemas.openxmlformats.org/drawingml/2006/picture">
-                  <pic:nvPicPr>
-                    <pic:cNvPr id="0" name="Picture 1"/>
-                    <pic:cNvPicPr>
-                      <a:picLocks noChangeAspect="1" noChangeArrowheads="1"/>
-                    </pic:cNvPicPr>
-                  </pic:nvPicPr>
-                  <pic:blipFill>
-                    <a:blip r:embed="rId10">
-                      <a:extLst>
-                        <a:ext uri="{28A0092B-C50C-407E-A947-70E740481C1C}">
-                          <a14:useLocalDpi xmlns:a14="http://schemas.microsoft.com/office/drawing/2010/main" val="0"/>
-                        </a:ext>
-                      </a:extLst>
-                    </a:blip>
-                    <a:srcRect/>
-                    <a:stretch>
-                      <a:fillRect/>
-                    </a:stretch>
-                  </pic:blipFill>
-                  <pic:spPr bwMode="auto">
-                    <a:xfrm>
-                      <a:off x="0" y="0"/>
-                      <a:ext cx="5228535" cy="6719607"/>
-                    </a:xfrm>
-                    <a:prstGeom prst="rect">
-                      <a:avLst/>
-                    </a:prstGeom>
-                    <a:noFill/>
-                    <a:ln>
-                      <a:noFill/>
-                    </a:ln>
-                  </pic:spPr>
-                </pic:pic>
-              </a:graphicData>
-            </a:graphic>
-          </wp:inline>
-        </w:drawing>
-      </w:r>
-    </w:p>
-    <w:p>
-      <w:pPr>
-        <w:spacing w:before="100" w:after="300"/>
-        <w:jc w:val="center"/>
-      </w:pPr>
-      <w:r>
-        <w:rPr>
-          <w:i/>
-          <w:iCs/>
-          <w:color w:val="64748B"/>
-          <w:sz w:val="19"/>
-          <w:szCs w:val="19"/>
-        </w:rPr>
-        <w:t>Fig. 3 — Team Page at tablet width. Cards reflow into a 2-column grid; all card content remains fully readable.</w:t>
-      </w:r>
-    </w:p>
-    <w:p>
-      <w:pPr>
-        <w:pStyle w:val="Heading2"/>
-        <w:spacing w:before="300" w:after="140"/>
-      </w:pPr>
-      <w:r>
-        <w:rPr>
-          <w:b/>
-          <w:bCs/>
-          <w:color w:val="2563EB"/>
-          <w:sz w:val="24"/>
-          <w:szCs w:val="24"/>
-        </w:rPr>
-        <w:lastRenderedPageBreak/>
-        <w:t>5.2 Mobile view</w:t>
-      </w:r>
-    </w:p>
-    <w:p>
-      <w:pPr>
-        <w:spacing w:after="160" w:line="300" w:lineRule="auto"/>
-      </w:pPr>
-      <w:r>
-        <w:rPr>
-          <w:color w:val="334155"/>
-          <w:sz w:val="21"/>
-          <w:szCs w:val="21"/>
-        </w:rPr>
-        <w:t>On mobile, the card grid collapses to a single column so no content overlaps or overflows, and every card remains fully legible without horizontal scrolling.</w:t>
-      </w:r>
-    </w:p>
-    <w:p>
-      <w:pPr>
-        <w:spacing w:before="200"/>
-        <w:jc w:val="center"/>
-      </w:pPr>
-      <w:r>
-        <w:rPr>
-          <w:noProof/>
-        </w:rPr>
-        <w:drawing>
-          <wp:inline distT="0" distB="0" distL="0" distR="0" wp14:anchorId="43DCD484" wp14:editId="4AD811AC">
-            <wp:extent cx="2971800" cy="5975891"/>
-            <wp:effectExtent l="0" t="0" r="0" b="6350"/>
-            <wp:docPr id="803720627" name="Picture 2"/>
-            <wp:cNvGraphicFramePr>
-              <a:graphicFrameLocks xmlns:a="http://schemas.openxmlformats.org/drawingml/2006/main" noChangeAspect="1"/>
-            </wp:cNvGraphicFramePr>
-            <a:graphic xmlns:a="http://schemas.openxmlformats.org/drawingml/2006/main">
-              <a:graphicData uri="http://schemas.openxmlformats.org/drawingml/2006/picture">
-                <pic:pic xmlns:pic="http://schemas.openxmlformats.org/drawingml/2006/picture">
-                  <pic:nvPicPr>
-                    <pic:cNvPr id="0" name="Picture 2"/>
-                    <pic:cNvPicPr>
-                      <a:picLocks noChangeAspect="1" noChangeArrowheads="1"/>
-                    </pic:cNvPicPr>
-                  </pic:nvPicPr>
-                  <pic:blipFill>
-                    <a:blip r:embed="rId11">
-                      <a:extLst>
-                        <a:ext uri="{28A0092B-C50C-407E-A947-70E740481C1C}">
-                          <a14:useLocalDpi xmlns:a14="http://schemas.microsoft.com/office/drawing/2010/main" val="0"/>
-                        </a:ext>
-                      </a:extLst>
-                    </a:blip>
-                    <a:srcRect/>
-                    <a:stretch>
-                      <a:fillRect/>
-                    </a:stretch>
-                  </pic:blipFill>
-                  <pic:spPr bwMode="auto">
-                    <a:xfrm>
-                      <a:off x="0" y="0"/>
-                      <a:ext cx="2983590" cy="5999599"/>
-                    </a:xfrm>
-                    <a:prstGeom prst="rect">
-                      <a:avLst/>
-                    </a:prstGeom>
-                    <a:noFill/>
-                    <a:ln>
-                      <a:noFill/>
-                    </a:ln>
-                  </pic:spPr>
-                </pic:pic>
-              </a:graphicData>
-            </a:graphic>
-          </wp:inline>
-        </w:drawing>
-      </w:r>
-    </w:p>
-    <w:p>
-      <w:pPr>
-        <w:spacing w:before="100" w:after="300"/>
-        <w:jc w:val="center"/>
-      </w:pPr>
-      <w:r>
-        <w:rPr>
-          <w:i/>
-          <w:iCs/>
-          <w:color w:val="64748B"/>
-          <w:sz w:val="19"/>
-          <w:szCs w:val="19"/>
-        </w:rPr>
-        <w:t>Fig. 4 — Mobile view (top of page): header, hero copy, and first two member cards in single-column layout.</w:t>
-      </w:r>
-    </w:p>
-    <w:p>
-      <w:pPr>
-        <w:spacing w:before="200"/>
-        <w:jc w:val="center"/>
-      </w:pPr>
-      <w:r>
-        <w:rPr>
-          <w:noProof/>
-        </w:rPr>
-        <w:lastRenderedPageBreak/>
-        <w:drawing>
-          <wp:inline distT="0" distB="0" distL="0" distR="0" wp14:anchorId="70443297" wp14:editId="19FAAE72">
-            <wp:extent cx="2933700" cy="5895608"/>
-            <wp:effectExtent l="0" t="0" r="0" b="0"/>
-            <wp:docPr id="690690715" name="Picture 3"/>
-            <wp:cNvGraphicFramePr>
-              <a:graphicFrameLocks xmlns:a="http://schemas.openxmlformats.org/drawingml/2006/main" noChangeAspect="1"/>
-            </wp:cNvGraphicFramePr>
-            <a:graphic xmlns:a="http://schemas.openxmlformats.org/drawingml/2006/main">
-              <a:graphicData uri="http://schemas.openxmlformats.org/drawingml/2006/picture">
-                <pic:pic xmlns:pic="http://schemas.openxmlformats.org/drawingml/2006/picture">
-                  <pic:nvPicPr>
-                    <pic:cNvPr id="0" name="Picture 3"/>
-                    <pic:cNvPicPr>
-                      <a:picLocks noChangeAspect="1" noChangeArrowheads="1"/>
-                    </pic:cNvPicPr>
-                  </pic:nvPicPr>
-                  <pic:blipFill>
-                    <a:blip r:embed="rId12">
-                      <a:extLst>
-                        <a:ext uri="{28A0092B-C50C-407E-A947-70E740481C1C}">
-                          <a14:useLocalDpi xmlns:a14="http://schemas.microsoft.com/office/drawing/2010/main" val="0"/>
-                        </a:ext>
-                      </a:extLst>
-                    </a:blip>
-                    <a:srcRect/>
-                    <a:stretch>
-                      <a:fillRect/>
-                    </a:stretch>
-                  </pic:blipFill>
-                  <pic:spPr bwMode="auto">
-                    <a:xfrm>
-                      <a:off x="0" y="0"/>
-                      <a:ext cx="2940040" cy="5908349"/>
-                    </a:xfrm>
-                    <a:prstGeom prst="rect">
-                      <a:avLst/>
-                    </a:prstGeom>
-                    <a:noFill/>
-                    <a:ln>
-                      <a:noFill/>
-                    </a:ln>
-                  </pic:spPr>
-                </pic:pic>
-              </a:graphicData>
-            </a:graphic>
-          </wp:inline>
-        </w:drawing>
-      </w:r>
-    </w:p>
-    <w:p>
-      <w:pPr>
-        <w:spacing w:before="100" w:after="300"/>
-        <w:jc w:val="center"/>
-      </w:pPr>
-      <w:r>
-        <w:rPr>
-          <w:i/>
-          <w:iCs/>
-          <w:color w:val="64748B"/>
-          <w:sz w:val="19"/>
-          <w:szCs w:val="19"/>
-        </w:rPr>
-        <w:t>Fig. 5 — Mobile view (continued): remaining member cards, confirming consistent single-column card treatment.</w:t>
-      </w:r>
-    </w:p>
-    <w:p>
-      <w:r>
-        <w:br w:type="page"/>
-      </w:r>
-    </w:p>
-    <w:p>
-      <w:pPr>
-        <w:pStyle w:val="Heading1"/>
-        <w:pBdr>
-          <w:bottom w:val="single" w:sz="6" w:space="4" w:color="2563EB"/>
-        </w:pBdr>
-        <w:spacing w:before="400" w:after="200"/>
-      </w:pPr>
-      <w:r>
-        <w:rPr>
-          <w:b/>
-          <w:bCs/>
-          <w:color w:val="1E293B"/>
-          <w:sz w:val="30"/>
-          <w:szCs w:val="30"/>
-        </w:rPr>
-        <w:lastRenderedPageBreak/>
-        <w:t>6. Requirements Traceability — Functional Requirements</w:t>
-      </w:r>
-    </w:p>
-    <w:p>
-      <w:pPr>
-        <w:spacing w:after="160" w:line="300" w:lineRule="auto"/>
-      </w:pPr>
-      <w:r>
-        <w:rPr>
-          <w:color w:val="334155"/>
-          <w:sz w:val="21"/>
-          <w:szCs w:val="21"/>
-        </w:rPr>
-        <w:t>The table below maps every functional requirement from the BA document to the specific design evidence in this deliverable.</w:t>
+        <w:t>Grey — Not applicable at the UX stage; to be verified later.</w:t>
       </w:r>
     </w:p>
     <w:tbl>
@@ -1684,10 +1692,10 @@
         <w:tblLook w:val="0000" w:firstRow="0" w:lastRow="0" w:firstColumn="0" w:lastColumn="0" w:noHBand="0" w:noVBand="0"/>
       </w:tblPr>
       <w:tblGrid>
-        <w:gridCol w:w="900"/>
-        <w:gridCol w:w="3400"/>
-        <w:gridCol w:w="3800"/>
-        <w:gridCol w:w="1500"/>
+        <w:gridCol w:w="877"/>
+        <w:gridCol w:w="3274"/>
+        <w:gridCol w:w="3660"/>
+        <w:gridCol w:w="1789"/>
       </w:tblGrid>
       <w:tr>
         <w:tblPrEx>
@@ -1883,7 +1891,7 @@
         <w:tc>
           <w:tcPr>
             <w:tcW w:w="1500" w:type="dxa"/>
-            <w:shd w:val="clear" w:color="auto" w:fill="FFFFFF"/>
+            <w:shd w:val="clear" w:color="auto" w:fill="DCFCE7"/>
             <w:tcMar>
               <w:top w:w="100" w:type="dxa"/>
               <w:left w:w="120" w:type="dxa"/>
@@ -1900,8 +1908,8 @@
                 <w:b/>
                 <w:bCs/>
                 <w:color w:val="15803D"/>
-                <w:sz w:val="18"/>
-                <w:szCs w:val="18"/>
+                <w:sz w:val="17"/>
+                <w:szCs w:val="17"/>
               </w:rPr>
               <w:t>✓ Addressed</w:t>
             </w:r>
@@ -1989,7 +1997,7 @@
         <w:tc>
           <w:tcPr>
             <w:tcW w:w="1500" w:type="dxa"/>
-            <w:shd w:val="clear" w:color="auto" w:fill="F1F5F9"/>
+            <w:shd w:val="clear" w:color="auto" w:fill="DCFCE7"/>
             <w:tcMar>
               <w:top w:w="100" w:type="dxa"/>
               <w:left w:w="120" w:type="dxa"/>
@@ -2006,8 +2014,8 @@
                 <w:b/>
                 <w:bCs/>
                 <w:color w:val="15803D"/>
-                <w:sz w:val="18"/>
-                <w:szCs w:val="18"/>
+                <w:sz w:val="17"/>
+                <w:szCs w:val="17"/>
               </w:rPr>
               <w:t>✓ Addressed</w:t>
             </w:r>
@@ -2095,7 +2103,7 @@
         <w:tc>
           <w:tcPr>
             <w:tcW w:w="1500" w:type="dxa"/>
-            <w:shd w:val="clear" w:color="auto" w:fill="FFFFFF"/>
+            <w:shd w:val="clear" w:color="auto" w:fill="DCFCE7"/>
             <w:tcMar>
               <w:top w:w="100" w:type="dxa"/>
               <w:left w:w="120" w:type="dxa"/>
@@ -2112,8 +2120,8 @@
                 <w:b/>
                 <w:bCs/>
                 <w:color w:val="15803D"/>
-                <w:sz w:val="18"/>
-                <w:szCs w:val="18"/>
+                <w:sz w:val="17"/>
+                <w:szCs w:val="17"/>
               </w:rPr>
               <w:t>✓ Addressed</w:t>
             </w:r>
@@ -2201,7 +2209,7 @@
         <w:tc>
           <w:tcPr>
             <w:tcW w:w="1500" w:type="dxa"/>
-            <w:shd w:val="clear" w:color="auto" w:fill="F1F5F9"/>
+            <w:shd w:val="clear" w:color="auto" w:fill="DCFCE7"/>
             <w:tcMar>
               <w:top w:w="100" w:type="dxa"/>
               <w:left w:w="120" w:type="dxa"/>
@@ -2218,8 +2226,8 @@
                 <w:b/>
                 <w:bCs/>
                 <w:color w:val="15803D"/>
-                <w:sz w:val="18"/>
-                <w:szCs w:val="18"/>
+                <w:sz w:val="17"/>
+                <w:szCs w:val="17"/>
               </w:rPr>
               <w:t>✓ Addressed</w:t>
             </w:r>
@@ -2300,14 +2308,14 @@
                 <w:sz w:val="19"/>
                 <w:szCs w:val="19"/>
               </w:rPr>
-              <w:t>Styled error state mocked up in full — see Fig. 1b</w:t>
+              <w:t>Error state fully mocked up — Fig. 1b. Loading-state visuals not separately designed; existing loading behaviour is to be preserved unchanged and verified during implementation.</w:t>
             </w:r>
           </w:p>
         </w:tc>
         <w:tc>
           <w:tcPr>
             <w:tcW w:w="1500" w:type="dxa"/>
-            <w:shd w:val="clear" w:color="auto" w:fill="FFFFFF"/>
+            <w:shd w:val="clear" w:color="auto" w:fill="FEF3C7"/>
             <w:tcMar>
               <w:top w:w="100" w:type="dxa"/>
               <w:left w:w="120" w:type="dxa"/>
@@ -2323,11 +2331,11 @@
               <w:rPr>
                 <w:b/>
                 <w:bCs/>
-                <w:color w:val="15803D"/>
-                <w:sz w:val="18"/>
-                <w:szCs w:val="18"/>
-              </w:rPr>
-              <w:t>✓ Addressed</w:t>
+                <w:color w:val="B45309"/>
+                <w:sz w:val="17"/>
+                <w:szCs w:val="17"/>
+              </w:rPr>
+              <w:t>Partially addressed — loading state verified at implementation</w:t>
             </w:r>
           </w:p>
         </w:tc>
@@ -2413,7 +2421,7 @@
         <w:tc>
           <w:tcPr>
             <w:tcW w:w="1500" w:type="dxa"/>
-            <w:shd w:val="clear" w:color="auto" w:fill="F1F5F9"/>
+            <w:shd w:val="clear" w:color="auto" w:fill="DCFCE7"/>
             <w:tcMar>
               <w:top w:w="100" w:type="dxa"/>
               <w:left w:w="120" w:type="dxa"/>
@@ -2430,8 +2438,8 @@
                 <w:b/>
                 <w:bCs/>
                 <w:color w:val="15803D"/>
-                <w:sz w:val="18"/>
-                <w:szCs w:val="18"/>
+                <w:sz w:val="17"/>
+                <w:szCs w:val="17"/>
               </w:rPr>
               <w:t>✓ Addressed</w:t>
             </w:r>
@@ -2512,14 +2520,14 @@
                 <w:sz w:val="19"/>
                 <w:szCs w:val="19"/>
               </w:rPr>
-              <w:t>User stays on Login Page with fields populated; styled error banner shown — Fig. 1b</w:t>
+              <w:t>User stays on Login Page; styled error banner shown — Fig. 1b</w:t>
             </w:r>
           </w:p>
         </w:tc>
         <w:tc>
           <w:tcPr>
             <w:tcW w:w="1500" w:type="dxa"/>
-            <w:shd w:val="clear" w:color="auto" w:fill="FFFFFF"/>
+            <w:shd w:val="clear" w:color="auto" w:fill="DCFCE7"/>
             <w:tcMar>
               <w:top w:w="100" w:type="dxa"/>
               <w:left w:w="120" w:type="dxa"/>
@@ -2536,8 +2544,8 @@
                 <w:b/>
                 <w:bCs/>
                 <w:color w:val="15803D"/>
-                <w:sz w:val="18"/>
-                <w:szCs w:val="18"/>
+                <w:sz w:val="17"/>
+                <w:szCs w:val="17"/>
               </w:rPr>
               <w:t>✓ Addressed</w:t>
             </w:r>
@@ -2618,14 +2626,14 @@
                 <w:sz w:val="19"/>
                 <w:szCs w:val="19"/>
               </w:rPr>
-              <w:t>Confirmed as functional requirement handed to Dev; not a UX-layer change</w:t>
+              <w:t>Design supports a /team destination; redirect logic is a Dev-layer implementation, not a UX-layer change</w:t>
             </w:r>
           </w:p>
         </w:tc>
         <w:tc>
           <w:tcPr>
             <w:tcW w:w="1500" w:type="dxa"/>
-            <w:shd w:val="clear" w:color="auto" w:fill="F1F5F9"/>
+            <w:shd w:val="clear" w:color="auto" w:fill="FEF3C7"/>
             <w:tcMar>
               <w:top w:w="100" w:type="dxa"/>
               <w:left w:w="120" w:type="dxa"/>
@@ -2641,11 +2649,11 @@
               <w:rPr>
                 <w:b/>
                 <w:bCs/>
-                <w:color w:val="15803D"/>
-                <w:sz w:val="18"/>
-                <w:szCs w:val="18"/>
-              </w:rPr>
-              <w:t>✓ Addressed</w:t>
+                <w:color w:val="B45309"/>
+                <w:sz w:val="17"/>
+                <w:szCs w:val="17"/>
+              </w:rPr>
+              <w:t>Design supports requirement — to be implemented/verified by Dev</w:t>
             </w:r>
           </w:p>
         </w:tc>
@@ -2724,14 +2732,14 @@
                 <w:sz w:val="19"/>
                 <w:szCs w:val="19"/>
               </w:rPr>
-              <w:t>Confirmed with Dev/BA; design targets the /team route</w:t>
+              <w:t>Design targets the /team route</w:t>
             </w:r>
           </w:p>
         </w:tc>
         <w:tc>
           <w:tcPr>
             <w:tcW w:w="1500" w:type="dxa"/>
-            <w:shd w:val="clear" w:color="auto" w:fill="FFFFFF"/>
+            <w:shd w:val="clear" w:color="auto" w:fill="FEF3C7"/>
             <w:tcMar>
               <w:top w:w="100" w:type="dxa"/>
               <w:left w:w="120" w:type="dxa"/>
@@ -2747,11 +2755,11 @@
               <w:rPr>
                 <w:b/>
                 <w:bCs/>
-                <w:color w:val="15803D"/>
-                <w:sz w:val="18"/>
-                <w:szCs w:val="18"/>
-              </w:rPr>
-              <w:t>✓ Addressed</w:t>
+                <w:color w:val="B45309"/>
+                <w:sz w:val="17"/>
+                <w:szCs w:val="17"/>
+              </w:rPr>
+              <w:t>Design supports requirement — to be implemented/verified by Dev</w:t>
             </w:r>
           </w:p>
         </w:tc>
@@ -2837,7 +2845,7 @@
         <w:tc>
           <w:tcPr>
             <w:tcW w:w="1500" w:type="dxa"/>
-            <w:shd w:val="clear" w:color="auto" w:fill="F1F5F9"/>
+            <w:shd w:val="clear" w:color="auto" w:fill="DCFCE7"/>
             <w:tcMar>
               <w:top w:w="100" w:type="dxa"/>
               <w:left w:w="120" w:type="dxa"/>
@@ -2854,8 +2862,8 @@
                 <w:b/>
                 <w:bCs/>
                 <w:color w:val="15803D"/>
-                <w:sz w:val="18"/>
-                <w:szCs w:val="18"/>
+                <w:sz w:val="17"/>
+                <w:szCs w:val="17"/>
               </w:rPr>
               <w:t>✓ Addressed</w:t>
             </w:r>
@@ -2936,14 +2944,14 @@
                 <w:sz w:val="19"/>
                 <w:szCs w:val="19"/>
               </w:rPr>
-              <w:t>Functional/routing requirement — no design impact, confirmed with BA</w:t>
+              <w:t>Functional/routing requirement; design itself has no dependency on how this is triggered</w:t>
             </w:r>
           </w:p>
         </w:tc>
         <w:tc>
           <w:tcPr>
             <w:tcW w:w="1500" w:type="dxa"/>
-            <w:shd w:val="clear" w:color="auto" w:fill="FFFFFF"/>
+            <w:shd w:val="clear" w:color="auto" w:fill="FEF3C7"/>
             <w:tcMar>
               <w:top w:w="100" w:type="dxa"/>
               <w:left w:w="120" w:type="dxa"/>
@@ -2959,11 +2967,11 @@
               <w:rPr>
                 <w:b/>
                 <w:bCs/>
-                <w:color w:val="15803D"/>
-                <w:sz w:val="18"/>
-                <w:szCs w:val="18"/>
-              </w:rPr>
-              <w:t>✓ Addressed</w:t>
+                <w:color w:val="B45309"/>
+                <w:sz w:val="17"/>
+                <w:szCs w:val="17"/>
+              </w:rPr>
+              <w:t>Design supports requirement — to be implemented/verified by Dev</w:t>
             </w:r>
           </w:p>
         </w:tc>
@@ -3049,7 +3057,7 @@
         <w:tc>
           <w:tcPr>
             <w:tcW w:w="1500" w:type="dxa"/>
-            <w:shd w:val="clear" w:color="auto" w:fill="F1F5F9"/>
+            <w:shd w:val="clear" w:color="auto" w:fill="DCFCE7"/>
             <w:tcMar>
               <w:top w:w="100" w:type="dxa"/>
               <w:left w:w="120" w:type="dxa"/>
@@ -3066,8 +3074,8 @@
                 <w:b/>
                 <w:bCs/>
                 <w:color w:val="15803D"/>
-                <w:sz w:val="18"/>
-                <w:szCs w:val="18"/>
+                <w:sz w:val="17"/>
+                <w:szCs w:val="17"/>
               </w:rPr>
               <w:t>✓ Addressed</w:t>
             </w:r>
@@ -3104,6 +3112,7 @@
                 <w:sz w:val="19"/>
                 <w:szCs w:val="19"/>
               </w:rPr>
+              <w:lastRenderedPageBreak/>
               <w:t>FR-13</w:t>
             </w:r>
           </w:p>
@@ -3184,14 +3193,14 @@
                 <w:sz w:val="19"/>
                 <w:szCs w:val="19"/>
               </w:rPr>
-              <w:t xml:space="preserve"> Sivagnanam — Fig. 2</w:t>
+              <w:t xml:space="preserve"> Sivagnanam — Fig. 2. Roster completeness to be confirmed — see Section 10.</w:t>
             </w:r>
           </w:p>
         </w:tc>
         <w:tc>
           <w:tcPr>
             <w:tcW w:w="1500" w:type="dxa"/>
-            <w:shd w:val="clear" w:color="auto" w:fill="FFFFFF"/>
+            <w:shd w:val="clear" w:color="auto" w:fill="DCFCE7"/>
             <w:tcMar>
               <w:top w:w="100" w:type="dxa"/>
               <w:left w:w="120" w:type="dxa"/>
@@ -3208,8 +3217,8 @@
                 <w:b/>
                 <w:bCs/>
                 <w:color w:val="15803D"/>
-                <w:sz w:val="18"/>
-                <w:szCs w:val="18"/>
+                <w:sz w:val="17"/>
+                <w:szCs w:val="17"/>
               </w:rPr>
               <w:t>✓ Addressed</w:t>
             </w:r>
@@ -3297,7 +3306,7 @@
         <w:tc>
           <w:tcPr>
             <w:tcW w:w="1500" w:type="dxa"/>
-            <w:shd w:val="clear" w:color="auto" w:fill="F1F5F9"/>
+            <w:shd w:val="clear" w:color="auto" w:fill="DCFCE7"/>
             <w:tcMar>
               <w:top w:w="100" w:type="dxa"/>
               <w:left w:w="120" w:type="dxa"/>
@@ -3314,8 +3323,8 @@
                 <w:b/>
                 <w:bCs/>
                 <w:color w:val="15803D"/>
-                <w:sz w:val="18"/>
-                <w:szCs w:val="18"/>
+                <w:sz w:val="17"/>
+                <w:szCs w:val="17"/>
               </w:rPr>
               <w:t>✓ Addressed</w:t>
             </w:r>
@@ -3403,7 +3412,7 @@
         <w:tc>
           <w:tcPr>
             <w:tcW w:w="1500" w:type="dxa"/>
-            <w:shd w:val="clear" w:color="auto" w:fill="FFFFFF"/>
+            <w:shd w:val="clear" w:color="auto" w:fill="DCFCE7"/>
             <w:tcMar>
               <w:top w:w="100" w:type="dxa"/>
               <w:left w:w="120" w:type="dxa"/>
@@ -3420,8 +3429,8 @@
                 <w:b/>
                 <w:bCs/>
                 <w:color w:val="15803D"/>
-                <w:sz w:val="18"/>
-                <w:szCs w:val="18"/>
+                <w:sz w:val="17"/>
+                <w:szCs w:val="17"/>
               </w:rPr>
               <w:t>✓ Addressed</w:t>
             </w:r>
@@ -3502,14 +3511,14 @@
                 <w:sz w:val="19"/>
                 <w:szCs w:val="19"/>
               </w:rPr>
-              <w:t>This document is the approved design submitted for BA validation</w:t>
+              <w:t>This design has been submitted for BA validation; approval pending</w:t>
             </w:r>
           </w:p>
         </w:tc>
         <w:tc>
           <w:tcPr>
             <w:tcW w:w="1500" w:type="dxa"/>
-            <w:shd w:val="clear" w:color="auto" w:fill="F1F5F9"/>
+            <w:shd w:val="clear" w:color="auto" w:fill="DCFCE7"/>
             <w:tcMar>
               <w:top w:w="100" w:type="dxa"/>
               <w:left w:w="120" w:type="dxa"/>
@@ -3526,8 +3535,8 @@
                 <w:b/>
                 <w:bCs/>
                 <w:color w:val="15803D"/>
-                <w:sz w:val="18"/>
-                <w:szCs w:val="18"/>
+                <w:sz w:val="17"/>
+                <w:szCs w:val="17"/>
               </w:rPr>
               <w:t>✓ Addressed</w:t>
             </w:r>
@@ -3578,10 +3587,10 @@
         <w:tblLook w:val="0000" w:firstRow="0" w:lastRow="0" w:firstColumn="0" w:lastColumn="0" w:noHBand="0" w:noVBand="0"/>
       </w:tblPr>
       <w:tblGrid>
-        <w:gridCol w:w="900"/>
-        <w:gridCol w:w="3400"/>
-        <w:gridCol w:w="3800"/>
-        <w:gridCol w:w="1500"/>
+        <w:gridCol w:w="877"/>
+        <w:gridCol w:w="3275"/>
+        <w:gridCol w:w="3659"/>
+        <w:gridCol w:w="1789"/>
       </w:tblGrid>
       <w:tr>
         <w:tblPrEx>
@@ -3795,7 +3804,7 @@
         <w:tc>
           <w:tcPr>
             <w:tcW w:w="1500" w:type="dxa"/>
-            <w:shd w:val="clear" w:color="auto" w:fill="FFFFFF"/>
+            <w:shd w:val="clear" w:color="auto" w:fill="DCFCE7"/>
             <w:tcMar>
               <w:top w:w="100" w:type="dxa"/>
               <w:left w:w="120" w:type="dxa"/>
@@ -3812,8 +3821,8 @@
                 <w:b/>
                 <w:bCs/>
                 <w:color w:val="15803D"/>
-                <w:sz w:val="18"/>
-                <w:szCs w:val="18"/>
+                <w:sz w:val="17"/>
+                <w:szCs w:val="17"/>
               </w:rPr>
               <w:t>✓ Addressed</w:t>
             </w:r>
@@ -3894,14 +3903,14 @@
                 <w:sz w:val="19"/>
                 <w:szCs w:val="19"/>
               </w:rPr>
-              <w:t>Routing behaviour confirmed with BA; no design conflict</w:t>
+              <w:t>Routing/behavioural requirement; no design conflict identified</w:t>
             </w:r>
           </w:p>
         </w:tc>
         <w:tc>
           <w:tcPr>
             <w:tcW w:w="1500" w:type="dxa"/>
-            <w:shd w:val="clear" w:color="auto" w:fill="F1F5F9"/>
+            <w:shd w:val="clear" w:color="auto" w:fill="FEF3C7"/>
             <w:tcMar>
               <w:top w:w="100" w:type="dxa"/>
               <w:left w:w="120" w:type="dxa"/>
@@ -3917,11 +3926,11 @@
               <w:rPr>
                 <w:b/>
                 <w:bCs/>
-                <w:color w:val="15803D"/>
-                <w:sz w:val="18"/>
-                <w:szCs w:val="18"/>
-              </w:rPr>
-              <w:t>✓ Addressed</w:t>
+                <w:color w:val="B45309"/>
+                <w:sz w:val="17"/>
+                <w:szCs w:val="17"/>
+              </w:rPr>
+              <w:t>Design supports requirement — to be implemented/verified by Dev</w:t>
             </w:r>
           </w:p>
         </w:tc>
@@ -4007,7 +4016,7 @@
         <w:tc>
           <w:tcPr>
             <w:tcW w:w="1500" w:type="dxa"/>
-            <w:shd w:val="clear" w:color="auto" w:fill="FFFFFF"/>
+            <w:shd w:val="clear" w:color="auto" w:fill="DCFCE7"/>
             <w:tcMar>
               <w:top w:w="100" w:type="dxa"/>
               <w:left w:w="120" w:type="dxa"/>
@@ -4024,8 +4033,8 @@
                 <w:b/>
                 <w:bCs/>
                 <w:color w:val="15803D"/>
-                <w:sz w:val="18"/>
-                <w:szCs w:val="18"/>
+                <w:sz w:val="17"/>
+                <w:szCs w:val="17"/>
               </w:rPr>
               <w:t>✓ Addressed</w:t>
             </w:r>
@@ -4113,7 +4122,7 @@
         <w:tc>
           <w:tcPr>
             <w:tcW w:w="1500" w:type="dxa"/>
-            <w:shd w:val="clear" w:color="auto" w:fill="F1F5F9"/>
+            <w:shd w:val="clear" w:color="auto" w:fill="DCFCE7"/>
             <w:tcMar>
               <w:top w:w="100" w:type="dxa"/>
               <w:left w:w="120" w:type="dxa"/>
@@ -4130,8 +4139,8 @@
                 <w:b/>
                 <w:bCs/>
                 <w:color w:val="15803D"/>
-                <w:sz w:val="18"/>
-                <w:szCs w:val="18"/>
+                <w:sz w:val="17"/>
+                <w:szCs w:val="17"/>
               </w:rPr>
               <w:t>✓ Addressed</w:t>
             </w:r>
@@ -4219,7 +4228,7 @@
         <w:tc>
           <w:tcPr>
             <w:tcW w:w="1500" w:type="dxa"/>
-            <w:shd w:val="clear" w:color="auto" w:fill="FFFFFF"/>
+            <w:shd w:val="clear" w:color="auto" w:fill="DCFCE7"/>
             <w:tcMar>
               <w:top w:w="100" w:type="dxa"/>
               <w:left w:w="120" w:type="dxa"/>
@@ -4236,8 +4245,8 @@
                 <w:b/>
                 <w:bCs/>
                 <w:color w:val="15803D"/>
-                <w:sz w:val="18"/>
-                <w:szCs w:val="18"/>
+                <w:sz w:val="17"/>
+                <w:szCs w:val="17"/>
               </w:rPr>
               <w:t>✓ Addressed</w:t>
             </w:r>
@@ -4325,7 +4334,7 @@
         <w:tc>
           <w:tcPr>
             <w:tcW w:w="1500" w:type="dxa"/>
-            <w:shd w:val="clear" w:color="auto" w:fill="F1F5F9"/>
+            <w:shd w:val="clear" w:color="auto" w:fill="DCFCE7"/>
             <w:tcMar>
               <w:top w:w="100" w:type="dxa"/>
               <w:left w:w="120" w:type="dxa"/>
@@ -4342,8 +4351,8 @@
                 <w:b/>
                 <w:bCs/>
                 <w:color w:val="15803D"/>
-                <w:sz w:val="18"/>
-                <w:szCs w:val="18"/>
+                <w:sz w:val="17"/>
+                <w:szCs w:val="17"/>
               </w:rPr>
               <w:t>✓ Addressed</w:t>
             </w:r>
@@ -4434,14 +4443,14 @@
                 <w:sz w:val="19"/>
                 <w:szCs w:val="19"/>
               </w:rPr>
-              <w:t>All four members show complete name, role, and blurb data</w:t>
+              <w:t>Current mock-up shows all four members with complete data (Fig. 2); incomplete member information should be flagged during content/design validation and that profile treated as not complete</w:t>
             </w:r>
           </w:p>
         </w:tc>
         <w:tc>
           <w:tcPr>
             <w:tcW w:w="1500" w:type="dxa"/>
-            <w:shd w:val="clear" w:color="auto" w:fill="FFFFFF"/>
+            <w:shd w:val="clear" w:color="auto" w:fill="FEF3C7"/>
             <w:tcMar>
               <w:top w:w="100" w:type="dxa"/>
               <w:left w:w="120" w:type="dxa"/>
@@ -4457,11 +4466,11 @@
               <w:rPr>
                 <w:b/>
                 <w:bCs/>
-                <w:color w:val="15803D"/>
-                <w:sz w:val="18"/>
-                <w:szCs w:val="18"/>
-              </w:rPr>
-              <w:t>✓ Addressed</w:t>
+                <w:color w:val="B45309"/>
+                <w:sz w:val="17"/>
+                <w:szCs w:val="17"/>
+              </w:rPr>
+              <w:t>Behaviour defined — mock-up demonstrates the complete case only</w:t>
             </w:r>
           </w:p>
         </w:tc>
@@ -4547,7 +4556,7 @@
         <w:tc>
           <w:tcPr>
             <w:tcW w:w="1500" w:type="dxa"/>
-            <w:shd w:val="clear" w:color="auto" w:fill="F1F5F9"/>
+            <w:shd w:val="clear" w:color="auto" w:fill="DCFCE7"/>
             <w:tcMar>
               <w:top w:w="100" w:type="dxa"/>
               <w:left w:w="120" w:type="dxa"/>
@@ -4564,8 +4573,8 @@
                 <w:b/>
                 <w:bCs/>
                 <w:color w:val="15803D"/>
-                <w:sz w:val="18"/>
-                <w:szCs w:val="18"/>
+                <w:sz w:val="17"/>
+                <w:szCs w:val="17"/>
               </w:rPr>
               <w:t>✓ Addressed</w:t>
             </w:r>
@@ -4610,10 +4619,10 @@
         <w:tblLook w:val="0000" w:firstRow="0" w:lastRow="0" w:firstColumn="0" w:lastColumn="0" w:noHBand="0" w:noVBand="0"/>
       </w:tblPr>
       <w:tblGrid>
-        <w:gridCol w:w="900"/>
-        <w:gridCol w:w="3400"/>
-        <w:gridCol w:w="3800"/>
-        <w:gridCol w:w="1500"/>
+        <w:gridCol w:w="888"/>
+        <w:gridCol w:w="3324"/>
+        <w:gridCol w:w="3693"/>
+        <w:gridCol w:w="1695"/>
       </w:tblGrid>
       <w:tr>
         <w:tblPrEx>
@@ -4809,7 +4818,7 @@
         <w:tc>
           <w:tcPr>
             <w:tcW w:w="1500" w:type="dxa"/>
-            <w:shd w:val="clear" w:color="auto" w:fill="FFFFFF"/>
+            <w:shd w:val="clear" w:color="auto" w:fill="DCFCE7"/>
             <w:tcMar>
               <w:top w:w="100" w:type="dxa"/>
               <w:left w:w="120" w:type="dxa"/>
@@ -4826,8 +4835,8 @@
                 <w:b/>
                 <w:bCs/>
                 <w:color w:val="15803D"/>
-                <w:sz w:val="18"/>
-                <w:szCs w:val="18"/>
+                <w:sz w:val="17"/>
+                <w:szCs w:val="17"/>
               </w:rPr>
               <w:t>✓ Addressed</w:t>
             </w:r>
@@ -4908,14 +4917,32 @@
                 <w:sz w:val="19"/>
                 <w:szCs w:val="19"/>
               </w:rPr>
-              <w:t>High-contrast text, labelled EMAIL/PASSWORD fields; alt text to be added at build time</w:t>
+              <w:t xml:space="preserve">High-contrast text and labelled EMAIL/PASSWORD fields shown in </w:t>
+            </w:r>
+            <w:proofErr w:type="spellStart"/>
+            <w:r>
+              <w:rPr>
+                <w:color w:val="1E293B"/>
+                <w:sz w:val="19"/>
+                <w:szCs w:val="19"/>
+              </w:rPr>
+              <w:t>mockups</w:t>
+            </w:r>
+            <w:proofErr w:type="spellEnd"/>
+            <w:r>
+              <w:rPr>
+                <w:color w:val="1E293B"/>
+                <w:sz w:val="19"/>
+                <w:szCs w:val="19"/>
+              </w:rPr>
+              <w:t>; focus states and image alt text can only be fully verified once implemented — alt text is planned to be added at build time.</w:t>
             </w:r>
           </w:p>
         </w:tc>
         <w:tc>
           <w:tcPr>
             <w:tcW w:w="1500" w:type="dxa"/>
-            <w:shd w:val="clear" w:color="auto" w:fill="F1F5F9"/>
+            <w:shd w:val="clear" w:color="auto" w:fill="FEF3C7"/>
             <w:tcMar>
               <w:top w:w="100" w:type="dxa"/>
               <w:left w:w="120" w:type="dxa"/>
@@ -4931,11 +4958,11 @@
               <w:rPr>
                 <w:b/>
                 <w:bCs/>
-                <w:color w:val="15803D"/>
-                <w:sz w:val="18"/>
-                <w:szCs w:val="18"/>
-              </w:rPr>
-              <w:t>✓ Addressed</w:t>
+                <w:color w:val="B45309"/>
+                <w:sz w:val="17"/>
+                <w:szCs w:val="17"/>
+              </w:rPr>
+              <w:t>Design addressed — implementation verification required</w:t>
             </w:r>
           </w:p>
         </w:tc>
@@ -5021,7 +5048,7 @@
         <w:tc>
           <w:tcPr>
             <w:tcW w:w="1500" w:type="dxa"/>
-            <w:shd w:val="clear" w:color="auto" w:fill="FFFFFF"/>
+            <w:shd w:val="clear" w:color="auto" w:fill="DCFCE7"/>
             <w:tcMar>
               <w:top w:w="100" w:type="dxa"/>
               <w:left w:w="120" w:type="dxa"/>
@@ -5038,8 +5065,8 @@
                 <w:b/>
                 <w:bCs/>
                 <w:color w:val="15803D"/>
-                <w:sz w:val="18"/>
-                <w:szCs w:val="18"/>
+                <w:sz w:val="17"/>
+                <w:szCs w:val="17"/>
               </w:rPr>
               <w:t>✓ Addressed</w:t>
             </w:r>
@@ -5127,7 +5154,7 @@
         <w:tc>
           <w:tcPr>
             <w:tcW w:w="1500" w:type="dxa"/>
-            <w:shd w:val="clear" w:color="auto" w:fill="F1F5F9"/>
+            <w:shd w:val="clear" w:color="auto" w:fill="DCFCE7"/>
             <w:tcMar>
               <w:top w:w="100" w:type="dxa"/>
               <w:left w:w="120" w:type="dxa"/>
@@ -5144,8 +5171,8 @@
                 <w:b/>
                 <w:bCs/>
                 <w:color w:val="15803D"/>
-                <w:sz w:val="18"/>
-                <w:szCs w:val="18"/>
+                <w:sz w:val="17"/>
+                <w:szCs w:val="17"/>
               </w:rPr>
               <w:t>✓ Addressed</w:t>
             </w:r>
@@ -5182,6 +5209,7 @@
                 <w:sz w:val="19"/>
                 <w:szCs w:val="19"/>
               </w:rPr>
+              <w:lastRenderedPageBreak/>
               <w:t>NFR-05</w:t>
             </w:r>
           </w:p>
@@ -5244,14 +5272,14 @@
                 <w:sz w:val="19"/>
                 <w:szCs w:val="19"/>
               </w:rPr>
-              <w:t>Design-only deliverable; to be confirmed again once implemented by Dev</w:t>
+              <w:t>This is a design-only deliverable; no code has been written yet, so this cannot be verified at the UX stage</w:t>
             </w:r>
           </w:p>
         </w:tc>
         <w:tc>
           <w:tcPr>
             <w:tcW w:w="1500" w:type="dxa"/>
-            <w:shd w:val="clear" w:color="auto" w:fill="FFFFFF"/>
+            <w:shd w:val="clear" w:color="auto" w:fill="E2E8F0"/>
             <w:tcMar>
               <w:top w:w="100" w:type="dxa"/>
               <w:left w:w="120" w:type="dxa"/>
@@ -5267,11 +5295,11 @@
               <w:rPr>
                 <w:b/>
                 <w:bCs/>
-                <w:color w:val="15803D"/>
-                <w:sz w:val="18"/>
-                <w:szCs w:val="18"/>
-              </w:rPr>
-              <w:t>✓ Addressed</w:t>
+                <w:color w:val="475569"/>
+                <w:sz w:val="17"/>
+                <w:szCs w:val="17"/>
+              </w:rPr>
+              <w:t>N/A at UX stage — to be verified during development/testing</w:t>
             </w:r>
           </w:p>
         </w:tc>
@@ -5487,7 +5515,7 @@
           <w:sz w:val="21"/>
           <w:szCs w:val="21"/>
         </w:rPr>
-        <w:t>Team member information has been implemented as static content, consistent with the Mock Sprint constraint in Section 9 of the requirements.</w:t>
+        <w:t>Team member information is designed to be implemented as static content, consistent with the Mock Sprint constraint in Section 9 of the requirements.</w:t>
       </w:r>
     </w:p>
     <w:p>
@@ -5506,7 +5534,111 @@
           <w:sz w:val="30"/>
           <w:szCs w:val="30"/>
         </w:rPr>
-        <w:t>10. BA Validation Sign-off</w:t>
+        <w:t>10. Outstanding Items Before Final Sign-off</w:t>
+      </w:r>
+    </w:p>
+    <w:p>
+      <w:pPr>
+        <w:spacing w:after="160" w:line="300" w:lineRule="auto"/>
+      </w:pPr>
+      <w:r>
+        <w:rPr>
+          <w:color w:val="334155"/>
+          <w:sz w:val="21"/>
+          <w:szCs w:val="21"/>
+        </w:rPr>
+        <w:t>The following items were raised during PM review and should be resolved before the BA completes validation:</w:t>
+      </w:r>
+    </w:p>
+    <w:p>
+      <w:pPr>
+        <w:pStyle w:val="ListParagraph"/>
+        <w:numPr>
+          <w:ilvl w:val="0"/>
+          <w:numId w:val="2"/>
+        </w:numPr>
+        <w:spacing w:after="80"/>
+      </w:pPr>
+      <w:r>
+        <w:rPr>
+          <w:color w:val="334155"/>
+          <w:sz w:val="21"/>
+          <w:szCs w:val="21"/>
+        </w:rPr>
+        <w:t xml:space="preserve">Confirm that the four members shown on the Team Page — </w:t>
+      </w:r>
+      <w:proofErr w:type="spellStart"/>
+      <w:r>
+        <w:rPr>
+          <w:color w:val="334155"/>
+          <w:sz w:val="21"/>
+          <w:szCs w:val="21"/>
+        </w:rPr>
+        <w:t>Jianqi</w:t>
+      </w:r>
+      <w:proofErr w:type="spellEnd"/>
+      <w:r>
+        <w:rPr>
+          <w:color w:val="334155"/>
+          <w:sz w:val="21"/>
+          <w:szCs w:val="21"/>
+        </w:rPr>
+        <w:t xml:space="preserve"> Lu, Chan Hoang Truong, Faridullah Jabbar Khil, and </w:t>
+      </w:r>
+      <w:proofErr w:type="spellStart"/>
+      <w:r>
+        <w:rPr>
+          <w:color w:val="334155"/>
+          <w:sz w:val="21"/>
+          <w:szCs w:val="21"/>
+        </w:rPr>
+        <w:t>Shakthijhaa</w:t>
+      </w:r>
+      <w:proofErr w:type="spellEnd"/>
+      <w:r>
+        <w:rPr>
+          <w:color w:val="334155"/>
+          <w:sz w:val="21"/>
+          <w:szCs w:val="21"/>
+        </w:rPr>
+        <w:t xml:space="preserve"> Sivagnanam — represent the complete current Team 40 roster, since FR-13 requires every member to be represented.</w:t>
+      </w:r>
+    </w:p>
+    <w:p>
+      <w:pPr>
+        <w:pStyle w:val="ListParagraph"/>
+        <w:numPr>
+          <w:ilvl w:val="0"/>
+          <w:numId w:val="2"/>
+        </w:numPr>
+        <w:spacing w:after="80"/>
+      </w:pPr>
+      <w:r>
+        <w:rPr>
+          <w:color w:val="334155"/>
+          <w:sz w:val="21"/>
+          <w:szCs w:val="21"/>
+        </w:rPr>
+        <w:t>Confirm the redirect/routing requirements (FR-08, FR-09, FR-11, EC-02) directly with Dev, since these are implementation-layer items the UX design supports but does not itself verify.</w:t>
+      </w:r>
+    </w:p>
+    <w:p>
+      <w:pPr>
+        <w:pStyle w:val="Heading1"/>
+        <w:pBdr>
+          <w:bottom w:val="single" w:sz="6" w:space="4" w:color="2563EB"/>
+        </w:pBdr>
+        <w:spacing w:before="400" w:after="200"/>
+      </w:pPr>
+      <w:r>
+        <w:rPr>
+          <w:b/>
+          <w:bCs/>
+          <w:color w:val="1E293B"/>
+          <w:sz w:val="30"/>
+          <w:szCs w:val="30"/>
+        </w:rPr>
+        <w:t>11. BA Validation Sign-off</w:t>
       </w:r>
     </w:p>
     <w:p>
@@ -5935,10 +6067,96 @@
 <file path=word/numbering.xml><?xml version="1.0" encoding="utf-8"?>
 <w:numbering xmlns:wpc="http://schemas.microsoft.com/office/word/2010/wordprocessingCanvas" xmlns:cx="http://schemas.microsoft.com/office/drawing/2014/chartex" xmlns:cx1="http://schemas.microsoft.com/office/drawing/2015/9/8/chartex" xmlns:cx2="http://schemas.microsoft.com/office/drawing/2015/10/21/chartex" xmlns:cx3="http://schemas.microsoft.com/office/drawing/2016/5/9/chartex" xmlns:cx4="http://schemas.microsoft.com/office/drawing/2016/5/10/chartex" xmlns:cx5="http://schemas.microsoft.com/office/drawing/2016/5/11/chartex" xmlns:cx6="http://schemas.microsoft.com/office/drawing/2016/5/12/chartex" xmlns:cx7="http://schemas.microsoft.com/office/drawing/2016/5/13/chartex" xmlns:cx8="http://schemas.microsoft.com/office/drawing/2016/5/14/chartex" xmlns:mc="http://schemas.openxmlformats.org/markup-compatibility/2006" xmlns:aink="http://schemas.microsoft.com/office/drawing/2016/ink" xmlns:am3d="http://schemas.microsoft.com/office/drawing/2017/model3d" xmlns:o="urn:schemas-microsoft-com:office:office" xmlns:oel="http://schemas.microsoft.com/office/2019/extlst" xmlns:r="http://schemas.openxmlformats.org/officeDocument/2006/relationships" xmlns:m="http://schemas.openxmlformats.org/officeDocument/2006/math" xmlns:v="urn:schemas-microsoft-com:vml" xmlns:wp14="http://schemas.microsoft.com/office/word/2010/wordprocessingDrawing" xmlns:wp="http://schemas.openxmlformats.org/drawingml/2006/wordprocessingDrawing" xmlns:w10="urn:schemas-microsoft-com:office:word" xmlns:w="http://schemas.openxmlformats.org/wordprocessingml/2006/main" xmlns:w14="http://schemas.microsoft.com/office/word/2010/wordml" xmlns:w15="http://schemas.microsoft.com/office/word/2012/wordml" xmlns:w16cei="http://schemas.microsoft.com/office/word/2026/wordml/cei" xmlns:w16cex="http://schemas.microsoft.com/office/word/2018/wordml/cex" xmlns:w16cid="http://schemas.microsoft.com/office/word/2016/wordml/cid" xmlns:w16="http://schemas.microsoft.com/office/word/2018/wordml" xmlns:w16du="http://schemas.microsoft.com/office/word/2023/wordml/word16du" xmlns:w16sdtdh="http://schemas.microsoft.com/office/word/2020/wordml/sdtdatahash" xmlns:w16sdtfl="http://schemas.microsoft.com/office/word/2024/wordml/sdtformatlock" xmlns:w16se="http://schemas.microsoft.com/office/word/2015/wordml/symex" xmlns:wpg="http://schemas.microsoft.com/office/word/2010/wordprocessingGroup" xmlns:wpi="http://schemas.microsoft.com/office/word/2010/wordprocessingInk" xmlns:wne="http://schemas.microsoft.com/office/word/2006/wordml" xmlns:wps="http://schemas.microsoft.com/office/word/2010/wordprocessingShape" mc:Ignorable="w14 w15 w16se w16cid w16 w16cex w16sdtdh w16sdtfl w16du wp14">
   <w:abstractNum w:abstractNumId="0" w15:restartNumberingAfterBreak="0">
-    <w:nsid w:val="724A5B81"/>
+    <w:nsid w:val="092461C8"/>
     <w:multiLevelType w:val="hybridMultilevel"/>
-    <w:tmpl w:val="7936A1D2"/>
-    <w:lvl w:ilvl="0" w:tplc="A48E4904">
+    <w:tmpl w:val="E4C26354"/>
+    <w:lvl w:ilvl="0" w:tplc="EF14904A">
+      <w:start w:val="1"/>
+      <w:numFmt w:val="bullet"/>
+      <w:lvlText w:val="●"/>
+      <w:lvlJc w:val="left"/>
+      <w:pPr>
+        <w:ind w:left="720" w:hanging="360"/>
+      </w:pPr>
+    </w:lvl>
+    <w:lvl w:ilvl="1" w:tplc="F0D849A8">
+      <w:start w:val="1"/>
+      <w:numFmt w:val="bullet"/>
+      <w:lvlText w:val="○"/>
+      <w:lvlJc w:val="left"/>
+      <w:pPr>
+        <w:ind w:left="1440" w:hanging="360"/>
+      </w:pPr>
+    </w:lvl>
+    <w:lvl w:ilvl="2" w:tplc="2460D766">
+      <w:start w:val="1"/>
+      <w:numFmt w:val="bullet"/>
+      <w:lvlText w:val="■"/>
+      <w:lvlJc w:val="left"/>
+      <w:pPr>
+        <w:ind w:left="2160" w:hanging="360"/>
+      </w:pPr>
+    </w:lvl>
+    <w:lvl w:ilvl="3" w:tplc="E786C326">
+      <w:start w:val="1"/>
+      <w:numFmt w:val="bullet"/>
+      <w:lvlText w:val="●"/>
+      <w:lvlJc w:val="left"/>
+      <w:pPr>
+        <w:ind w:left="2880" w:hanging="360"/>
+      </w:pPr>
+    </w:lvl>
+    <w:lvl w:ilvl="4" w:tplc="173CB48E">
+      <w:start w:val="1"/>
+      <w:numFmt w:val="bullet"/>
+      <w:lvlText w:val="○"/>
+      <w:lvlJc w:val="left"/>
+      <w:pPr>
+        <w:ind w:left="3600" w:hanging="360"/>
+      </w:pPr>
+    </w:lvl>
+    <w:lvl w:ilvl="5" w:tplc="27B489B2">
+      <w:start w:val="1"/>
+      <w:numFmt w:val="bullet"/>
+      <w:lvlText w:val="■"/>
+      <w:lvlJc w:val="left"/>
+      <w:pPr>
+        <w:ind w:left="4320" w:hanging="360"/>
+      </w:pPr>
+    </w:lvl>
+    <w:lvl w:ilvl="6" w:tplc="025CF1FE">
+      <w:start w:val="1"/>
+      <w:numFmt w:val="bullet"/>
+      <w:lvlText w:val="●"/>
+      <w:lvlJc w:val="left"/>
+      <w:pPr>
+        <w:ind w:left="5040" w:hanging="360"/>
+      </w:pPr>
+    </w:lvl>
+    <w:lvl w:ilvl="7" w:tplc="42AC4288">
+      <w:start w:val="1"/>
+      <w:numFmt w:val="bullet"/>
+      <w:lvlText w:val="●"/>
+      <w:lvlJc w:val="left"/>
+      <w:pPr>
+        <w:ind w:left="5760" w:hanging="360"/>
+      </w:pPr>
+    </w:lvl>
+    <w:lvl w:ilvl="8" w:tplc="D81E9666">
+      <w:start w:val="1"/>
+      <w:numFmt w:val="bullet"/>
+      <w:lvlText w:val="●"/>
+      <w:lvlJc w:val="left"/>
+      <w:pPr>
+        <w:ind w:left="6480" w:hanging="360"/>
+      </w:pPr>
+    </w:lvl>
+  </w:abstractNum>
+  <w:abstractNum w:abstractNumId="1" w15:restartNumberingAfterBreak="0">
+    <w:nsid w:val="43CB0270"/>
+    <w:multiLevelType w:val="hybridMultilevel"/>
+    <w:tmpl w:val="7E502AE4"/>
+    <w:lvl w:ilvl="0" w:tplc="F7A2CE78">
       <w:start w:val="1"/>
       <w:numFmt w:val="bullet"/>
       <w:lvlText w:val="•"/>
@@ -5947,141 +6165,55 @@
         <w:ind w:left="420" w:hanging="260"/>
       </w:pPr>
     </w:lvl>
-    <w:lvl w:ilvl="1" w:tplc="73C4857E">
+    <w:lvl w:ilvl="1" w:tplc="49B8A27E">
       <w:numFmt w:val="decimal"/>
       <w:lvlText w:val=""/>
       <w:lvlJc w:val="left"/>
     </w:lvl>
-    <w:lvl w:ilvl="2" w:tplc="95C06BF2">
+    <w:lvl w:ilvl="2" w:tplc="3120FC44">
       <w:numFmt w:val="decimal"/>
       <w:lvlText w:val=""/>
       <w:lvlJc w:val="left"/>
     </w:lvl>
-    <w:lvl w:ilvl="3" w:tplc="8FFAEE8A">
+    <w:lvl w:ilvl="3" w:tplc="4D5ADBAE">
       <w:numFmt w:val="decimal"/>
       <w:lvlText w:val=""/>
       <w:lvlJc w:val="left"/>
     </w:lvl>
-    <w:lvl w:ilvl="4" w:tplc="B79C6D8E">
+    <w:lvl w:ilvl="4" w:tplc="383A587A">
       <w:numFmt w:val="decimal"/>
       <w:lvlText w:val=""/>
       <w:lvlJc w:val="left"/>
     </w:lvl>
-    <w:lvl w:ilvl="5" w:tplc="5FC0C9BE">
+    <w:lvl w:ilvl="5" w:tplc="CCB258C4">
       <w:numFmt w:val="decimal"/>
       <w:lvlText w:val=""/>
       <w:lvlJc w:val="left"/>
     </w:lvl>
-    <w:lvl w:ilvl="6" w:tplc="044ACDE6">
+    <w:lvl w:ilvl="6" w:tplc="DD9E8020">
       <w:numFmt w:val="decimal"/>
       <w:lvlText w:val=""/>
       <w:lvlJc w:val="left"/>
     </w:lvl>
-    <w:lvl w:ilvl="7" w:tplc="8744B47C">
+    <w:lvl w:ilvl="7" w:tplc="C4D4A600">
       <w:numFmt w:val="decimal"/>
       <w:lvlText w:val=""/>
       <w:lvlJc w:val="left"/>
     </w:lvl>
-    <w:lvl w:ilvl="8" w:tplc="AF3AD908">
+    <w:lvl w:ilvl="8" w:tplc="ECCAA3CE">
       <w:numFmt w:val="decimal"/>
       <w:lvlText w:val=""/>
       <w:lvlJc w:val="left"/>
     </w:lvl>
   </w:abstractNum>
-  <w:abstractNum w:abstractNumId="1" w15:restartNumberingAfterBreak="0">
-    <w:nsid w:val="737E0865"/>
-    <w:multiLevelType w:val="hybridMultilevel"/>
-    <w:tmpl w:val="71F8D6B8"/>
-    <w:lvl w:ilvl="0" w:tplc="E5C42CCC">
-      <w:start w:val="1"/>
-      <w:numFmt w:val="bullet"/>
-      <w:lvlText w:val="●"/>
-      <w:lvlJc w:val="left"/>
-      <w:pPr>
-        <w:ind w:left="720" w:hanging="360"/>
-      </w:pPr>
-    </w:lvl>
-    <w:lvl w:ilvl="1" w:tplc="097054EA">
-      <w:start w:val="1"/>
-      <w:numFmt w:val="bullet"/>
-      <w:lvlText w:val="○"/>
-      <w:lvlJc w:val="left"/>
-      <w:pPr>
-        <w:ind w:left="1440" w:hanging="360"/>
-      </w:pPr>
-    </w:lvl>
-    <w:lvl w:ilvl="2" w:tplc="25DE2A3A">
-      <w:start w:val="1"/>
-      <w:numFmt w:val="bullet"/>
-      <w:lvlText w:val="■"/>
-      <w:lvlJc w:val="left"/>
-      <w:pPr>
-        <w:ind w:left="2160" w:hanging="360"/>
-      </w:pPr>
-    </w:lvl>
-    <w:lvl w:ilvl="3" w:tplc="7B3C4B04">
-      <w:start w:val="1"/>
-      <w:numFmt w:val="bullet"/>
-      <w:lvlText w:val="●"/>
-      <w:lvlJc w:val="left"/>
-      <w:pPr>
-        <w:ind w:left="2880" w:hanging="360"/>
-      </w:pPr>
-    </w:lvl>
-    <w:lvl w:ilvl="4" w:tplc="54D02466">
-      <w:start w:val="1"/>
-      <w:numFmt w:val="bullet"/>
-      <w:lvlText w:val="○"/>
-      <w:lvlJc w:val="left"/>
-      <w:pPr>
-        <w:ind w:left="3600" w:hanging="360"/>
-      </w:pPr>
-    </w:lvl>
-    <w:lvl w:ilvl="5" w:tplc="BF521C94">
-      <w:start w:val="1"/>
-      <w:numFmt w:val="bullet"/>
-      <w:lvlText w:val="■"/>
-      <w:lvlJc w:val="left"/>
-      <w:pPr>
-        <w:ind w:left="4320" w:hanging="360"/>
-      </w:pPr>
-    </w:lvl>
-    <w:lvl w:ilvl="6" w:tplc="A4166562">
-      <w:start w:val="1"/>
-      <w:numFmt w:val="bullet"/>
-      <w:lvlText w:val="●"/>
-      <w:lvlJc w:val="left"/>
-      <w:pPr>
-        <w:ind w:left="5040" w:hanging="360"/>
-      </w:pPr>
-    </w:lvl>
-    <w:lvl w:ilvl="7" w:tplc="CCA6B0D0">
-      <w:start w:val="1"/>
-      <w:numFmt w:val="bullet"/>
-      <w:lvlText w:val="●"/>
-      <w:lvlJc w:val="left"/>
-      <w:pPr>
-        <w:ind w:left="5760" w:hanging="360"/>
-      </w:pPr>
-    </w:lvl>
-    <w:lvl w:ilvl="8" w:tplc="B3369CC4">
-      <w:start w:val="1"/>
-      <w:numFmt w:val="bullet"/>
-      <w:lvlText w:val="●"/>
-      <w:lvlJc w:val="left"/>
-      <w:pPr>
-        <w:ind w:left="6480" w:hanging="360"/>
-      </w:pPr>
-    </w:lvl>
-  </w:abstractNum>
-  <w:num w:numId="1" w16cid:durableId="344480716">
-    <w:abstractNumId w:val="1"/>
+  <w:num w:numId="1" w16cid:durableId="1796748139">
+    <w:abstractNumId w:val="0"/>
     <w:lvlOverride w:ilvl="0">
       <w:startOverride w:val="1"/>
     </w:lvlOverride>
   </w:num>
-  <w:num w:numId="2" w16cid:durableId="1662200810">
-    <w:abstractNumId w:val="0"/>
+  <w:num w:numId="2" w16cid:durableId="861166453">
+    <w:abstractNumId w:val="1"/>
     <w:lvlOverride w:ilvl="0">
       <w:startOverride w:val="1"/>
     </w:lvlOverride>

</xml_diff>

<commit_message>
docs: update UX design document
</commit_message>
<xml_diff>
--- a/docs/task2/ux/Team40-UX-Design-Validation.docx
+++ b/docs/task2/ux/Team40-UX-Design-Validation.docx
@@ -92,12 +92,6 @@
         <w:gridCol w:w="4600"/>
       </w:tblGrid>
       <w:tr>
-        <w:tblPrEx>
-          <w:tblCellMar>
-            <w:top w:w="0" w:type="dxa"/>
-            <w:bottom w:w="0" w:type="dxa"/>
-          </w:tblCellMar>
-        </w:tblPrEx>
         <w:trPr>
           <w:jc w:val="center"/>
         </w:trPr>
@@ -149,12 +143,6 @@
         </w:tc>
       </w:tr>
       <w:tr>
-        <w:tblPrEx>
-          <w:tblCellMar>
-            <w:top w:w="0" w:type="dxa"/>
-            <w:bottom w:w="0" w:type="dxa"/>
-          </w:tblCellMar>
-        </w:tblPrEx>
         <w:trPr>
           <w:jc w:val="center"/>
         </w:trPr>
@@ -194,34 +182,18 @@
             </w:tcMar>
           </w:tcPr>
           <w:p>
-            <w:proofErr w:type="spellStart"/>
-            <w:r>
-              <w:rPr>
-                <w:color w:val="1E293B"/>
-                <w:sz w:val="19"/>
-                <w:szCs w:val="19"/>
-              </w:rPr>
-              <w:t>Shakthijhaa</w:t>
-            </w:r>
-            <w:proofErr w:type="spellEnd"/>
-            <w:r>
-              <w:rPr>
-                <w:color w:val="1E293B"/>
-                <w:sz w:val="19"/>
-                <w:szCs w:val="19"/>
-              </w:rPr>
-              <w:t xml:space="preserve"> Sivagnanam — Business Analyst (validation)</w:t>
+            <w:r>
+              <w:rPr>
+                <w:color w:val="1E293B"/>
+                <w:sz w:val="19"/>
+                <w:szCs w:val="19"/>
+              </w:rPr>
+              <w:t>Shakthijhaa Sivagnanam — Business Analyst (validation)</w:t>
             </w:r>
           </w:p>
         </w:tc>
       </w:tr>
       <w:tr>
-        <w:tblPrEx>
-          <w:tblCellMar>
-            <w:top w:w="0" w:type="dxa"/>
-            <w:bottom w:w="0" w:type="dxa"/>
-          </w:tblCellMar>
-        </w:tblPrEx>
         <w:trPr>
           <w:jc w:val="center"/>
         </w:trPr>
@@ -273,12 +245,6 @@
         </w:tc>
       </w:tr>
       <w:tr>
-        <w:tblPrEx>
-          <w:tblCellMar>
-            <w:top w:w="0" w:type="dxa"/>
-            <w:bottom w:w="0" w:type="dxa"/>
-          </w:tblCellMar>
-        </w:tblPrEx>
         <w:trPr>
           <w:jc w:val="center"/>
         </w:trPr>
@@ -330,12 +296,6 @@
         </w:tc>
       </w:tr>
       <w:tr>
-        <w:tblPrEx>
-          <w:tblCellMar>
-            <w:top w:w="0" w:type="dxa"/>
-            <w:bottom w:w="0" w:type="dxa"/>
-          </w:tblCellMar>
-        </w:tblPrEx>
         <w:trPr>
           <w:jc w:val="center"/>
         </w:trPr>
@@ -387,12 +347,6 @@
         </w:tc>
       </w:tr>
       <w:tr>
-        <w:tblPrEx>
-          <w:tblCellMar>
-            <w:top w:w="0" w:type="dxa"/>
-            <w:bottom w:w="0" w:type="dxa"/>
-          </w:tblCellMar>
-        </w:tblPrEx>
         <w:trPr>
           <w:jc w:val="center"/>
         </w:trPr>
@@ -444,12 +398,6 @@
         </w:tc>
       </w:tr>
       <w:tr>
-        <w:tblPrEx>
-          <w:tblCellMar>
-            <w:top w:w="0" w:type="dxa"/>
-            <w:bottom w:w="0" w:type="dxa"/>
-          </w:tblCellMar>
-        </w:tblPrEx>
         <w:trPr>
           <w:jc w:val="center"/>
         </w:trPr>
@@ -704,6 +652,9 @@
         <w:jc w:val="center"/>
       </w:pPr>
       <w:r>
+        <w:rPr>
+          <w:noProof/>
+        </w:rPr>
         <w:lastRenderedPageBreak/>
         <w:drawing>
           <wp:inline distT="0" distB="0" distL="0" distR="0" wp14:anchorId="00B74E5C" wp14:editId="03CE09A2">
@@ -869,43 +820,7 @@
           <w:sz w:val="21"/>
           <w:szCs w:val="21"/>
         </w:rPr>
-        <w:t xml:space="preserve">The </w:t>
-      </w:r>
-      <w:proofErr w:type="spellStart"/>
-      <w:r>
-        <w:rPr>
-          <w:color w:val="334155"/>
-          <w:sz w:val="21"/>
-          <w:szCs w:val="21"/>
-        </w:rPr>
-        <w:t>mockup</w:t>
-      </w:r>
-      <w:proofErr w:type="spellEnd"/>
-      <w:r>
-        <w:rPr>
-          <w:color w:val="334155"/>
-          <w:sz w:val="21"/>
-          <w:szCs w:val="21"/>
-        </w:rPr>
-        <w:t xml:space="preserve"> below shows the Login Page in its error state, satisfying FR-07 and EC-01: on an invalid login attempt, the user remains on the Login </w:t>
-      </w:r>
-      <w:proofErr w:type="gramStart"/>
-      <w:r>
-        <w:rPr>
-          <w:color w:val="334155"/>
-          <w:sz w:val="21"/>
-          <w:szCs w:val="21"/>
-        </w:rPr>
-        <w:t>Page</w:t>
-      </w:r>
-      <w:proofErr w:type="gramEnd"/>
-      <w:r>
-        <w:rPr>
-          <w:color w:val="334155"/>
-          <w:sz w:val="21"/>
-          <w:szCs w:val="21"/>
-        </w:rPr>
-        <w:t xml:space="preserve"> and a clear, styled error message is displayed rather than being silently redirected or shown a generic browser alert.</w:t>
+        <w:t>The mockup below shows the Login Page in its error state, satisfying FR-07 and EC-01: on an invalid login attempt, the user remains on the Login Page and a clear, styled error message is displayed rather than being silently redirected or shown a generic browser alert.</w:t>
       </w:r>
     </w:p>
     <w:p>
@@ -914,6 +829,9 @@
         <w:jc w:val="center"/>
       </w:pPr>
       <w:r>
+        <w:rPr>
+          <w:noProof/>
+        </w:rPr>
         <w:lastRenderedPageBreak/>
         <w:drawing>
           <wp:inline distT="0" distB="0" distL="0" distR="0" wp14:anchorId="16A8B79B" wp14:editId="036128F5">
@@ -1032,25 +950,7 @@
           <w:sz w:val="21"/>
           <w:szCs w:val="21"/>
         </w:rPr>
-        <w:t xml:space="preserve">Copy is </w:t>
-      </w:r>
-      <w:proofErr w:type="gramStart"/>
-      <w:r>
-        <w:rPr>
-          <w:color w:val="334155"/>
-          <w:sz w:val="21"/>
-          <w:szCs w:val="21"/>
-        </w:rPr>
-        <w:t>plain-language</w:t>
-      </w:r>
-      <w:proofErr w:type="gramEnd"/>
-      <w:r>
-        <w:rPr>
-          <w:color w:val="334155"/>
-          <w:sz w:val="21"/>
-          <w:szCs w:val="21"/>
-        </w:rPr>
-        <w:t xml:space="preserve"> ("Incorrect email or password. Please try again.") rather than a technical/system-level error, so it remains clear to any user.</w:t>
+        <w:t>Copy is plain-language ("Incorrect email or password. Please try again.") rather than a technical/system-level error, so it remains clear to any user.</w:t>
       </w:r>
     </w:p>
     <w:p>
@@ -1068,25 +968,7 @@
           <w:sz w:val="21"/>
           <w:szCs w:val="21"/>
         </w:rPr>
-        <w:t xml:space="preserve">This </w:t>
-      </w:r>
-      <w:proofErr w:type="spellStart"/>
-      <w:r>
-        <w:rPr>
-          <w:color w:val="334155"/>
-          <w:sz w:val="21"/>
-          <w:szCs w:val="21"/>
-        </w:rPr>
-        <w:t>mockup</w:t>
-      </w:r>
-      <w:proofErr w:type="spellEnd"/>
-      <w:r>
-        <w:rPr>
-          <w:color w:val="334155"/>
-          <w:sz w:val="21"/>
-          <w:szCs w:val="21"/>
-        </w:rPr>
-        <w:t xml:space="preserve"> illustrates the error state only. Whether the email/password fields are cleared or retained after a failed attempt is existing application behaviour, not something newly defined by this design — the BA requirements do not specify it, and it is intentionally left unchanged rather than introduced as a new UX decision.</w:t>
+        <w:t>This mockup illustrates the error state only. Whether the email/password fields are cleared or retained after a failed attempt is existing application behaviour, not something newly defined by this design — the BA requirements do not specify it, and it is intentionally left unchanged rather than introduced as a new UX decision.</w:t>
       </w:r>
     </w:p>
     <w:p>
@@ -1127,6 +1009,9 @@
         <w:jc w:val="center"/>
       </w:pPr>
       <w:r>
+        <w:rPr>
+          <w:noProof/>
+        </w:rPr>
         <w:lastRenderedPageBreak/>
         <w:drawing>
           <wp:inline distT="0" distB="0" distL="0" distR="0" wp14:anchorId="6F8D15E3" wp14:editId="304472B0">
@@ -1698,12 +1583,6 @@
         <w:gridCol w:w="1789"/>
       </w:tblGrid>
       <w:tr>
-        <w:tblPrEx>
-          <w:tblCellMar>
-            <w:top w:w="0" w:type="dxa"/>
-            <w:bottom w:w="0" w:type="dxa"/>
-          </w:tblCellMar>
-        </w:tblPrEx>
         <w:trPr>
           <w:tblHeader/>
         </w:trPr>
@@ -1811,12 +1690,6 @@
         </w:tc>
       </w:tr>
       <w:tr>
-        <w:tblPrEx>
-          <w:tblCellMar>
-            <w:top w:w="0" w:type="dxa"/>
-            <w:bottom w:w="0" w:type="dxa"/>
-          </w:tblCellMar>
-        </w:tblPrEx>
         <w:tc>
           <w:tcPr>
             <w:tcW w:w="900" w:type="dxa"/>
@@ -1917,12 +1790,6 @@
         </w:tc>
       </w:tr>
       <w:tr>
-        <w:tblPrEx>
-          <w:tblCellMar>
-            <w:top w:w="0" w:type="dxa"/>
-            <w:bottom w:w="0" w:type="dxa"/>
-          </w:tblCellMar>
-        </w:tblPrEx>
         <w:tc>
           <w:tcPr>
             <w:tcW w:w="900" w:type="dxa"/>
@@ -2023,12 +1890,6 @@
         </w:tc>
       </w:tr>
       <w:tr>
-        <w:tblPrEx>
-          <w:tblCellMar>
-            <w:top w:w="0" w:type="dxa"/>
-            <w:bottom w:w="0" w:type="dxa"/>
-          </w:tblCellMar>
-        </w:tblPrEx>
         <w:tc>
           <w:tcPr>
             <w:tcW w:w="900" w:type="dxa"/>
@@ -2129,12 +1990,6 @@
         </w:tc>
       </w:tr>
       <w:tr>
-        <w:tblPrEx>
-          <w:tblCellMar>
-            <w:top w:w="0" w:type="dxa"/>
-            <w:bottom w:w="0" w:type="dxa"/>
-          </w:tblCellMar>
-        </w:tblPrEx>
         <w:tc>
           <w:tcPr>
             <w:tcW w:w="900" w:type="dxa"/>
@@ -2235,12 +2090,6 @@
         </w:tc>
       </w:tr>
       <w:tr>
-        <w:tblPrEx>
-          <w:tblCellMar>
-            <w:top w:w="0" w:type="dxa"/>
-            <w:bottom w:w="0" w:type="dxa"/>
-          </w:tblCellMar>
-        </w:tblPrEx>
         <w:tc>
           <w:tcPr>
             <w:tcW w:w="900" w:type="dxa"/>
@@ -2341,12 +2190,6 @@
         </w:tc>
       </w:tr>
       <w:tr>
-        <w:tblPrEx>
-          <w:tblCellMar>
-            <w:top w:w="0" w:type="dxa"/>
-            <w:bottom w:w="0" w:type="dxa"/>
-          </w:tblCellMar>
-        </w:tblPrEx>
         <w:tc>
           <w:tcPr>
             <w:tcW w:w="900" w:type="dxa"/>
@@ -2447,12 +2290,6 @@
         </w:tc>
       </w:tr>
       <w:tr>
-        <w:tblPrEx>
-          <w:tblCellMar>
-            <w:top w:w="0" w:type="dxa"/>
-            <w:bottom w:w="0" w:type="dxa"/>
-          </w:tblCellMar>
-        </w:tblPrEx>
         <w:tc>
           <w:tcPr>
             <w:tcW w:w="900" w:type="dxa"/>
@@ -2553,12 +2390,6 @@
         </w:tc>
       </w:tr>
       <w:tr>
-        <w:tblPrEx>
-          <w:tblCellMar>
-            <w:top w:w="0" w:type="dxa"/>
-            <w:bottom w:w="0" w:type="dxa"/>
-          </w:tblCellMar>
-        </w:tblPrEx>
         <w:tc>
           <w:tcPr>
             <w:tcW w:w="900" w:type="dxa"/>
@@ -2659,12 +2490,6 @@
         </w:tc>
       </w:tr>
       <w:tr>
-        <w:tblPrEx>
-          <w:tblCellMar>
-            <w:top w:w="0" w:type="dxa"/>
-            <w:bottom w:w="0" w:type="dxa"/>
-          </w:tblCellMar>
-        </w:tblPrEx>
         <w:tc>
           <w:tcPr>
             <w:tcW w:w="900" w:type="dxa"/>
@@ -2765,12 +2590,6 @@
         </w:tc>
       </w:tr>
       <w:tr>
-        <w:tblPrEx>
-          <w:tblCellMar>
-            <w:top w:w="0" w:type="dxa"/>
-            <w:bottom w:w="0" w:type="dxa"/>
-          </w:tblCellMar>
-        </w:tblPrEx>
         <w:tc>
           <w:tcPr>
             <w:tcW w:w="900" w:type="dxa"/>
@@ -2871,12 +2690,6 @@
         </w:tc>
       </w:tr>
       <w:tr>
-        <w:tblPrEx>
-          <w:tblCellMar>
-            <w:top w:w="0" w:type="dxa"/>
-            <w:bottom w:w="0" w:type="dxa"/>
-          </w:tblCellMar>
-        </w:tblPrEx>
         <w:tc>
           <w:tcPr>
             <w:tcW w:w="900" w:type="dxa"/>
@@ -2977,12 +2790,6 @@
         </w:tc>
       </w:tr>
       <w:tr>
-        <w:tblPrEx>
-          <w:tblCellMar>
-            <w:top w:w="0" w:type="dxa"/>
-            <w:bottom w:w="0" w:type="dxa"/>
-          </w:tblCellMar>
-        </w:tblPrEx>
         <w:tc>
           <w:tcPr>
             <w:tcW w:w="900" w:type="dxa"/>
@@ -3083,12 +2890,6 @@
         </w:tc>
       </w:tr>
       <w:tr>
-        <w:tblPrEx>
-          <w:tblCellMar>
-            <w:top w:w="0" w:type="dxa"/>
-            <w:bottom w:w="0" w:type="dxa"/>
-          </w:tblCellMar>
-        </w:tblPrEx>
         <w:tc>
           <w:tcPr>
             <w:tcW w:w="900" w:type="dxa"/>
@@ -3157,43 +2958,7 @@
                 <w:sz w:val="19"/>
                 <w:szCs w:val="19"/>
               </w:rPr>
-              <w:t xml:space="preserve">Four cards shown — </w:t>
-            </w:r>
-            <w:proofErr w:type="spellStart"/>
-            <w:r>
-              <w:rPr>
-                <w:color w:val="1E293B"/>
-                <w:sz w:val="19"/>
-                <w:szCs w:val="19"/>
-              </w:rPr>
-              <w:t>Jianqi</w:t>
-            </w:r>
-            <w:proofErr w:type="spellEnd"/>
-            <w:r>
-              <w:rPr>
-                <w:color w:val="1E293B"/>
-                <w:sz w:val="19"/>
-                <w:szCs w:val="19"/>
-              </w:rPr>
-              <w:t xml:space="preserve"> Lu, Chan Hoang Truong, Faridullah Jabbar Khil, </w:t>
-            </w:r>
-            <w:proofErr w:type="spellStart"/>
-            <w:r>
-              <w:rPr>
-                <w:color w:val="1E293B"/>
-                <w:sz w:val="19"/>
-                <w:szCs w:val="19"/>
-              </w:rPr>
-              <w:t>Shakthijhaa</w:t>
-            </w:r>
-            <w:proofErr w:type="spellEnd"/>
-            <w:r>
-              <w:rPr>
-                <w:color w:val="1E293B"/>
-                <w:sz w:val="19"/>
-                <w:szCs w:val="19"/>
-              </w:rPr>
-              <w:t xml:space="preserve"> Sivagnanam — Fig. 2. Roster completeness to be confirmed — see Section 10.</w:t>
+              <w:t>Four cards shown — Jianqi Lu, Chan Hoang Truong, Faridullah Jabbar Khil, Shakthijhaa Sivagnanam — Fig. 2. Roster completeness to be confirmed — see Section 10.</w:t>
             </w:r>
           </w:p>
         </w:tc>
@@ -3226,12 +2991,6 @@
         </w:tc>
       </w:tr>
       <w:tr>
-        <w:tblPrEx>
-          <w:tblCellMar>
-            <w:top w:w="0" w:type="dxa"/>
-            <w:bottom w:w="0" w:type="dxa"/>
-          </w:tblCellMar>
-        </w:tblPrEx>
         <w:tc>
           <w:tcPr>
             <w:tcW w:w="900" w:type="dxa"/>
@@ -3332,12 +3091,6 @@
         </w:tc>
       </w:tr>
       <w:tr>
-        <w:tblPrEx>
-          <w:tblCellMar>
-            <w:top w:w="0" w:type="dxa"/>
-            <w:bottom w:w="0" w:type="dxa"/>
-          </w:tblCellMar>
-        </w:tblPrEx>
         <w:tc>
           <w:tcPr>
             <w:tcW w:w="900" w:type="dxa"/>
@@ -3438,12 +3191,6 @@
         </w:tc>
       </w:tr>
       <w:tr>
-        <w:tblPrEx>
-          <w:tblCellMar>
-            <w:top w:w="0" w:type="dxa"/>
-            <w:bottom w:w="0" w:type="dxa"/>
-          </w:tblCellMar>
-        </w:tblPrEx>
         <w:tc>
           <w:tcPr>
             <w:tcW w:w="900" w:type="dxa"/>
@@ -3593,12 +3340,6 @@
         <w:gridCol w:w="1789"/>
       </w:tblGrid>
       <w:tr>
-        <w:tblPrEx>
-          <w:tblCellMar>
-            <w:top w:w="0" w:type="dxa"/>
-            <w:bottom w:w="0" w:type="dxa"/>
-          </w:tblCellMar>
-        </w:tblPrEx>
         <w:trPr>
           <w:tblHeader/>
         </w:trPr>
@@ -3706,12 +3447,6 @@
         </w:tc>
       </w:tr>
       <w:tr>
-        <w:tblPrEx>
-          <w:tblCellMar>
-            <w:top w:w="0" w:type="dxa"/>
-            <w:bottom w:w="0" w:type="dxa"/>
-          </w:tblCellMar>
-        </w:tblPrEx>
         <w:tc>
           <w:tcPr>
             <w:tcW w:w="900" w:type="dxa"/>
@@ -3779,25 +3514,7 @@
                 <w:sz w:val="19"/>
                 <w:szCs w:val="19"/>
               </w:rPr>
-              <w:t xml:space="preserve">Full error-state </w:t>
-            </w:r>
-            <w:proofErr w:type="spellStart"/>
-            <w:r>
-              <w:rPr>
-                <w:color w:val="1E293B"/>
-                <w:sz w:val="19"/>
-                <w:szCs w:val="19"/>
-              </w:rPr>
-              <w:t>mockup</w:t>
-            </w:r>
-            <w:proofErr w:type="spellEnd"/>
-            <w:r>
-              <w:rPr>
-                <w:color w:val="1E293B"/>
-                <w:sz w:val="19"/>
-                <w:szCs w:val="19"/>
-              </w:rPr>
-              <w:t xml:space="preserve"> provided: "Incorrect email or password. Please try again." — Fig. 1b</w:t>
+              <w:t>Full error-state mockup provided: "Incorrect email or password. Please try again." — Fig. 1b</w:t>
             </w:r>
           </w:p>
         </w:tc>
@@ -3830,12 +3547,6 @@
         </w:tc>
       </w:tr>
       <w:tr>
-        <w:tblPrEx>
-          <w:tblCellMar>
-            <w:top w:w="0" w:type="dxa"/>
-            <w:bottom w:w="0" w:type="dxa"/>
-          </w:tblCellMar>
-        </w:tblPrEx>
         <w:tc>
           <w:tcPr>
             <w:tcW w:w="900" w:type="dxa"/>
@@ -3936,12 +3647,6 @@
         </w:tc>
       </w:tr>
       <w:tr>
-        <w:tblPrEx>
-          <w:tblCellMar>
-            <w:top w:w="0" w:type="dxa"/>
-            <w:bottom w:w="0" w:type="dxa"/>
-          </w:tblCellMar>
-        </w:tblPrEx>
         <w:tc>
           <w:tcPr>
             <w:tcW w:w="900" w:type="dxa"/>
@@ -4042,12 +3747,6 @@
         </w:tc>
       </w:tr>
       <w:tr>
-        <w:tblPrEx>
-          <w:tblCellMar>
-            <w:top w:w="0" w:type="dxa"/>
-            <w:bottom w:w="0" w:type="dxa"/>
-          </w:tblCellMar>
-        </w:tblPrEx>
         <w:tc>
           <w:tcPr>
             <w:tcW w:w="900" w:type="dxa"/>
@@ -4148,12 +3847,6 @@
         </w:tc>
       </w:tr>
       <w:tr>
-        <w:tblPrEx>
-          <w:tblCellMar>
-            <w:top w:w="0" w:type="dxa"/>
-            <w:bottom w:w="0" w:type="dxa"/>
-          </w:tblCellMar>
-        </w:tblPrEx>
         <w:tc>
           <w:tcPr>
             <w:tcW w:w="900" w:type="dxa"/>
@@ -4254,12 +3947,6 @@
         </w:tc>
       </w:tr>
       <w:tr>
-        <w:tblPrEx>
-          <w:tblCellMar>
-            <w:top w:w="0" w:type="dxa"/>
-            <w:bottom w:w="0" w:type="dxa"/>
-          </w:tblCellMar>
-        </w:tblPrEx>
         <w:tc>
           <w:tcPr>
             <w:tcW w:w="900" w:type="dxa"/>
@@ -4360,12 +4047,6 @@
         </w:tc>
       </w:tr>
       <w:tr>
-        <w:tblPrEx>
-          <w:tblCellMar>
-            <w:top w:w="0" w:type="dxa"/>
-            <w:bottom w:w="0" w:type="dxa"/>
-          </w:tblCellMar>
-        </w:tblPrEx>
         <w:tc>
           <w:tcPr>
             <w:tcW w:w="900" w:type="dxa"/>
@@ -4411,18 +4092,8 @@
                 <w:sz w:val="19"/>
                 <w:szCs w:val="19"/>
               </w:rPr>
-              <w:t xml:space="preserve">Incomplete member profile is flagged as </w:t>
-            </w:r>
-            <w:proofErr w:type="gramStart"/>
-            <w:r>
-              <w:rPr>
-                <w:color w:val="1E293B"/>
-                <w:sz w:val="19"/>
-                <w:szCs w:val="19"/>
-              </w:rPr>
-              <w:t>not-done</w:t>
-            </w:r>
-            <w:proofErr w:type="gramEnd"/>
+              <w:t>Incomplete member profile is flagged as not-done</w:t>
+            </w:r>
           </w:p>
         </w:tc>
         <w:tc>
@@ -4476,12 +4147,6 @@
         </w:tc>
       </w:tr>
       <w:tr>
-        <w:tblPrEx>
-          <w:tblCellMar>
-            <w:top w:w="0" w:type="dxa"/>
-            <w:bottom w:w="0" w:type="dxa"/>
-          </w:tblCellMar>
-        </w:tblPrEx>
         <w:tc>
           <w:tcPr>
             <w:tcW w:w="900" w:type="dxa"/>
@@ -4625,12 +4290,6 @@
         <w:gridCol w:w="1695"/>
       </w:tblGrid>
       <w:tr>
-        <w:tblPrEx>
-          <w:tblCellMar>
-            <w:top w:w="0" w:type="dxa"/>
-            <w:bottom w:w="0" w:type="dxa"/>
-          </w:tblCellMar>
-        </w:tblPrEx>
         <w:trPr>
           <w:tblHeader/>
         </w:trPr>
@@ -4738,12 +4397,6 @@
         </w:tc>
       </w:tr>
       <w:tr>
-        <w:tblPrEx>
-          <w:tblCellMar>
-            <w:top w:w="0" w:type="dxa"/>
-            <w:bottom w:w="0" w:type="dxa"/>
-          </w:tblCellMar>
-        </w:tblPrEx>
         <w:tc>
           <w:tcPr>
             <w:tcW w:w="900" w:type="dxa"/>
@@ -4844,12 +4497,6 @@
         </w:tc>
       </w:tr>
       <w:tr>
-        <w:tblPrEx>
-          <w:tblCellMar>
-            <w:top w:w="0" w:type="dxa"/>
-            <w:bottom w:w="0" w:type="dxa"/>
-          </w:tblCellMar>
-        </w:tblPrEx>
         <w:tc>
           <w:tcPr>
             <w:tcW w:w="900" w:type="dxa"/>
@@ -4917,25 +4564,7 @@
                 <w:sz w:val="19"/>
                 <w:szCs w:val="19"/>
               </w:rPr>
-              <w:t xml:space="preserve">High-contrast text and labelled EMAIL/PASSWORD fields shown in </w:t>
-            </w:r>
-            <w:proofErr w:type="spellStart"/>
-            <w:r>
-              <w:rPr>
-                <w:color w:val="1E293B"/>
-                <w:sz w:val="19"/>
-                <w:szCs w:val="19"/>
-              </w:rPr>
-              <w:t>mockups</w:t>
-            </w:r>
-            <w:proofErr w:type="spellEnd"/>
-            <w:r>
-              <w:rPr>
-                <w:color w:val="1E293B"/>
-                <w:sz w:val="19"/>
-                <w:szCs w:val="19"/>
-              </w:rPr>
-              <w:t>; focus states and image alt text can only be fully verified once implemented — alt text is planned to be added at build time.</w:t>
+              <w:t>High-contrast text and labelled EMAIL/PASSWORD fields shown in mockups; focus states and image alt text can only be fully verified once implemented — alt text is planned to be added at build time.</w:t>
             </w:r>
           </w:p>
         </w:tc>
@@ -4968,12 +4597,6 @@
         </w:tc>
       </w:tr>
       <w:tr>
-        <w:tblPrEx>
-          <w:tblCellMar>
-            <w:top w:w="0" w:type="dxa"/>
-            <w:bottom w:w="0" w:type="dxa"/>
-          </w:tblCellMar>
-        </w:tblPrEx>
         <w:tc>
           <w:tcPr>
             <w:tcW w:w="900" w:type="dxa"/>
@@ -5074,12 +4697,6 @@
         </w:tc>
       </w:tr>
       <w:tr>
-        <w:tblPrEx>
-          <w:tblCellMar>
-            <w:top w:w="0" w:type="dxa"/>
-            <w:bottom w:w="0" w:type="dxa"/>
-          </w:tblCellMar>
-        </w:tblPrEx>
         <w:tc>
           <w:tcPr>
             <w:tcW w:w="900" w:type="dxa"/>
@@ -5180,12 +4797,6 @@
         </w:tc>
       </w:tr>
       <w:tr>
-        <w:tblPrEx>
-          <w:tblCellMar>
-            <w:top w:w="0" w:type="dxa"/>
-            <w:bottom w:w="0" w:type="dxa"/>
-          </w:tblCellMar>
-        </w:tblPrEx>
         <w:tc>
           <w:tcPr>
             <w:tcW w:w="900" w:type="dxa"/>
@@ -5232,25 +4843,7 @@
                 <w:sz w:val="19"/>
                 <w:szCs w:val="19"/>
               </w:rPr>
-              <w:t>No lint/</w:t>
-            </w:r>
-            <w:proofErr w:type="spellStart"/>
-            <w:r>
-              <w:rPr>
-                <w:color w:val="1E293B"/>
-                <w:sz w:val="19"/>
-                <w:szCs w:val="19"/>
-              </w:rPr>
-              <w:t>typecheck</w:t>
-            </w:r>
-            <w:proofErr w:type="spellEnd"/>
-            <w:r>
-              <w:rPr>
-                <w:color w:val="1E293B"/>
-                <w:sz w:val="19"/>
-                <w:szCs w:val="19"/>
-              </w:rPr>
-              <w:t>/build/test failures introduced</w:t>
+              <w:t>No lint/typecheck/build/test failures introduced</w:t>
             </w:r>
           </w:p>
         </w:tc>
@@ -5340,25 +4933,7 @@
           <w:sz w:val="21"/>
           <w:szCs w:val="21"/>
         </w:rPr>
-        <w:t xml:space="preserve">In line with Section 9 of the BA requirements, this design deliverable does not include, and was not intended to </w:t>
-      </w:r>
-      <w:proofErr w:type="gramStart"/>
-      <w:r>
-        <w:rPr>
-          <w:color w:val="334155"/>
-          <w:sz w:val="21"/>
-          <w:szCs w:val="21"/>
-        </w:rPr>
-        <w:t>include,</w:t>
-      </w:r>
-      <w:proofErr w:type="gramEnd"/>
-      <w:r>
-        <w:rPr>
-          <w:color w:val="334155"/>
-          <w:sz w:val="21"/>
-          <w:szCs w:val="21"/>
-        </w:rPr>
-        <w:t xml:space="preserve"> any of the following:</w:t>
+        <w:t>In line with Section 9 of the BA requirements, this design deliverable does not include, and was not intended to include, any of the following:</w:t>
       </w:r>
     </w:p>
     <w:p>
@@ -5534,102 +5109,8 @@
           <w:sz w:val="30"/>
           <w:szCs w:val="30"/>
         </w:rPr>
-        <w:t>10. Outstanding Items Before Final Sign-off</w:t>
-      </w:r>
-    </w:p>
-    <w:p>
-      <w:pPr>
-        <w:spacing w:after="160" w:line="300" w:lineRule="auto"/>
-      </w:pPr>
-      <w:r>
-        <w:rPr>
-          <w:color w:val="334155"/>
-          <w:sz w:val="21"/>
-          <w:szCs w:val="21"/>
-        </w:rPr>
-        <w:t>The following items were raised during PM review and should be resolved before the BA completes validation:</w:t>
-      </w:r>
-    </w:p>
-    <w:p>
-      <w:pPr>
-        <w:pStyle w:val="ListParagraph"/>
-        <w:numPr>
-          <w:ilvl w:val="0"/>
-          <w:numId w:val="2"/>
-        </w:numPr>
-        <w:spacing w:after="80"/>
-      </w:pPr>
-      <w:r>
-        <w:rPr>
-          <w:color w:val="334155"/>
-          <w:sz w:val="21"/>
-          <w:szCs w:val="21"/>
-        </w:rPr>
-        <w:t xml:space="preserve">Confirm that the four members shown on the Team Page — </w:t>
-      </w:r>
-      <w:proofErr w:type="spellStart"/>
-      <w:r>
-        <w:rPr>
-          <w:color w:val="334155"/>
-          <w:sz w:val="21"/>
-          <w:szCs w:val="21"/>
-        </w:rPr>
-        <w:t>Jianqi</w:t>
-      </w:r>
-      <w:proofErr w:type="spellEnd"/>
-      <w:r>
-        <w:rPr>
-          <w:color w:val="334155"/>
-          <w:sz w:val="21"/>
-          <w:szCs w:val="21"/>
-        </w:rPr>
-        <w:t xml:space="preserve"> Lu, Chan Hoang Truong, Faridullah Jabbar Khil, and </w:t>
-      </w:r>
-      <w:proofErr w:type="spellStart"/>
-      <w:r>
-        <w:rPr>
-          <w:color w:val="334155"/>
-          <w:sz w:val="21"/>
-          <w:szCs w:val="21"/>
-        </w:rPr>
-        <w:t>Shakthijhaa</w:t>
-      </w:r>
-      <w:proofErr w:type="spellEnd"/>
-      <w:r>
-        <w:rPr>
-          <w:color w:val="334155"/>
-          <w:sz w:val="21"/>
-          <w:szCs w:val="21"/>
-        </w:rPr>
-        <w:t xml:space="preserve"> Sivagnanam — represent the complete current Team 40 roster, since FR-13 requires every member to be represented.</w:t>
-      </w:r>
-    </w:p>
-    <w:p>
-      <w:pPr>
-        <w:pStyle w:val="ListParagraph"/>
-        <w:numPr>
-          <w:ilvl w:val="0"/>
-          <w:numId w:val="2"/>
-        </w:numPr>
-        <w:spacing w:after="80"/>
-      </w:pPr>
-      <w:r>
-        <w:rPr>
-          <w:color w:val="334155"/>
-          <w:sz w:val="21"/>
-          <w:szCs w:val="21"/>
-        </w:rPr>
-        <w:t>Confirm the redirect/routing requirements (FR-08, FR-09, FR-11, EC-02) directly with Dev, since these are implementation-layer items the UX design supports but does not itself verify.</w:t>
-      </w:r>
-    </w:p>
-    <w:p>
-      <w:pPr>
-        <w:pStyle w:val="Heading1"/>
-        <w:pBdr>
-          <w:bottom w:val="single" w:sz="6" w:space="4" w:color="2563EB"/>
-        </w:pBdr>
-        <w:spacing w:before="400" w:after="200"/>
-      </w:pPr>
+        <w:t>1</w:t>
+      </w:r>
       <w:r>
         <w:rPr>
           <w:b/>
@@ -5638,7 +5119,17 @@
           <w:sz w:val="30"/>
           <w:szCs w:val="30"/>
         </w:rPr>
-        <w:t>11. BA Validation Sign-off</w:t>
+        <w:t>0</w:t>
+      </w:r>
+      <w:r>
+        <w:rPr>
+          <w:b/>
+          <w:bCs/>
+          <w:color w:val="1E293B"/>
+          <w:sz w:val="30"/>
+          <w:szCs w:val="30"/>
+        </w:rPr>
+        <w:t>. BA Validation Sign-off</w:t>
       </w:r>
     </w:p>
     <w:p>
@@ -5678,12 +5169,6 @@
         <w:gridCol w:w="2200"/>
       </w:tblGrid>
       <w:tr>
-        <w:tblPrEx>
-          <w:tblCellMar>
-            <w:top w:w="0" w:type="dxa"/>
-            <w:bottom w:w="0" w:type="dxa"/>
-          </w:tblCellMar>
-        </w:tblPrEx>
         <w:tc>
           <w:tcPr>
             <w:tcW w:w="2200" w:type="dxa"/>
@@ -5782,12 +5267,6 @@
         </w:tc>
       </w:tr>
       <w:tr>
-        <w:tblPrEx>
-          <w:tblCellMar>
-            <w:top w:w="0" w:type="dxa"/>
-            <w:bottom w:w="0" w:type="dxa"/>
-          </w:tblCellMar>
-        </w:tblPrEx>
         <w:tc>
           <w:tcPr>
             <w:tcW w:w="2200" w:type="dxa"/>
@@ -5800,23 +5279,13 @@
             </w:tcMar>
           </w:tcPr>
           <w:p>
-            <w:proofErr w:type="spellStart"/>
-            <w:r>
-              <w:rPr>
-                <w:color w:val="1E293B"/>
-                <w:sz w:val="19"/>
-                <w:szCs w:val="19"/>
-              </w:rPr>
-              <w:t>Shakthijhaa</w:t>
-            </w:r>
-            <w:proofErr w:type="spellEnd"/>
-            <w:r>
-              <w:rPr>
-                <w:color w:val="1E293B"/>
-                <w:sz w:val="19"/>
-                <w:szCs w:val="19"/>
-              </w:rPr>
-              <w:t xml:space="preserve"> Sivagnanam (BA)</w:t>
+            <w:r>
+              <w:rPr>
+                <w:color w:val="1E293B"/>
+                <w:sz w:val="19"/>
+                <w:szCs w:val="19"/>
+              </w:rPr>
+              <w:t>Shakthijhaa Sivagnanam (BA)</w:t>
             </w:r>
           </w:p>
         </w:tc>

</xml_diff>